<commit_message>
update word file with curse work
</commit_message>
<xml_diff>
--- a/kursovik_ivanyuk_1748362416.docx
+++ b/kursovik_ivanyuk_1748362416.docx
@@ -1648,29 +1648,7 @@
                 <w:szCs w:val="26"/>
                 <w:lang w:eastAsia="ru-RU"/>
               </w:rPr>
-              <w:t>«_</w:t>
-            </w:r>
-            <w:proofErr w:type="gramStart"/>
-            <w:r>
-              <w:rPr>
-                <w:rFonts w:ascii="Times New Roman" w:hAnsi="Times New Roman" w:cs="Times New Roman"/>
-                <w:color w:val="000000"/>
-                <w:sz w:val="26"/>
-                <w:szCs w:val="26"/>
-                <w:lang w:eastAsia="ru-RU"/>
-              </w:rPr>
-              <w:t>_»_</w:t>
-            </w:r>
-            <w:proofErr w:type="gramEnd"/>
-            <w:r>
-              <w:rPr>
-                <w:rFonts w:ascii="Times New Roman" w:hAnsi="Times New Roman" w:cs="Times New Roman"/>
-                <w:color w:val="000000"/>
-                <w:sz w:val="26"/>
-                <w:szCs w:val="26"/>
-                <w:lang w:eastAsia="ru-RU"/>
-              </w:rPr>
-              <w:t>______20__ г.</w:t>
+              <w:t>«__»_______20__ г.</w:t>
             </w:r>
           </w:p>
         </w:tc>
@@ -2294,29 +2272,7 @@
                 <w:szCs w:val="26"/>
                 <w:lang w:eastAsia="ru-RU"/>
               </w:rPr>
-              <w:t>«_</w:t>
-            </w:r>
-            <w:proofErr w:type="gramStart"/>
-            <w:r>
-              <w:rPr>
-                <w:rFonts w:ascii="Times New Roman" w:hAnsi="Times New Roman" w:cs="Times New Roman"/>
-                <w:color w:val="000000"/>
-                <w:sz w:val="26"/>
-                <w:szCs w:val="26"/>
-                <w:lang w:eastAsia="ru-RU"/>
-              </w:rPr>
-              <w:t>_»_</w:t>
-            </w:r>
-            <w:proofErr w:type="gramEnd"/>
-            <w:r>
-              <w:rPr>
-                <w:rFonts w:ascii="Times New Roman" w:hAnsi="Times New Roman" w:cs="Times New Roman"/>
-                <w:color w:val="000000"/>
-                <w:sz w:val="26"/>
-                <w:szCs w:val="26"/>
-                <w:lang w:eastAsia="ru-RU"/>
-              </w:rPr>
-              <w:t>______20__ г.</w:t>
+              <w:t>«__»_______20__ г.</w:t>
             </w:r>
           </w:p>
         </w:tc>
@@ -2846,29 +2802,7 @@
                 <w:szCs w:val="26"/>
                 <w:lang w:eastAsia="ru-RU"/>
               </w:rPr>
-              <w:t>«_</w:t>
-            </w:r>
-            <w:proofErr w:type="gramStart"/>
-            <w:r>
-              <w:rPr>
-                <w:rFonts w:ascii="Times New Roman" w:hAnsi="Times New Roman" w:cs="Times New Roman"/>
-                <w:color w:val="000000"/>
-                <w:sz w:val="26"/>
-                <w:szCs w:val="26"/>
-                <w:lang w:eastAsia="ru-RU"/>
-              </w:rPr>
-              <w:t>_»_</w:t>
-            </w:r>
-            <w:proofErr w:type="gramEnd"/>
-            <w:r>
-              <w:rPr>
-                <w:rFonts w:ascii="Times New Roman" w:hAnsi="Times New Roman" w:cs="Times New Roman"/>
-                <w:color w:val="000000"/>
-                <w:sz w:val="26"/>
-                <w:szCs w:val="26"/>
-                <w:lang w:eastAsia="ru-RU"/>
-              </w:rPr>
-              <w:t>______20__ г.</w:t>
+              <w:t>«__»_______20__ г.</w:t>
             </w:r>
           </w:p>
         </w:tc>
@@ -4691,20 +4625,8 @@
                       <w:szCs w:val="24"/>
                       <w:lang w:eastAsia="ru-RU"/>
                     </w:rPr>
-                    <w:t xml:space="preserve">Целевая </w:t>
+                    <w:t xml:space="preserve">Целевая установка:   </w:t>
                   </w:r>
-                  <w:proofErr w:type="gramStart"/>
-                  <w:r>
-                    <w:rPr>
-                      <w:rFonts w:ascii="Times New Roman" w:eastAsia="Times New Roman" w:hAnsi="Times New Roman" w:cs="Times New Roman"/>
-                      <w:b/>
-                      <w:sz w:val="24"/>
-                      <w:szCs w:val="24"/>
-                      <w:lang w:eastAsia="ru-RU"/>
-                    </w:rPr>
-                    <w:t xml:space="preserve">установка:   </w:t>
-                  </w:r>
-                  <w:proofErr w:type="gramEnd"/>
                 </w:p>
               </w:tc>
               <w:tc>
@@ -4976,31 +4898,7 @@
                       <w:szCs w:val="24"/>
                       <w:lang w:eastAsia="ru-RU"/>
                     </w:rPr>
-                    <w:t>Разработка структуры конфигурации в 1</w:t>
-                  </w:r>
-                  <w:proofErr w:type="gramStart"/>
-                  <w:r>
-                    <w:rPr>
-                      <w:rFonts w:ascii="Times New Roman" w:eastAsia="Times New Roman" w:hAnsi="Times New Roman" w:cs="Times New Roman"/>
-                      <w:b/>
-                      <w:bCs/>
-                      <w:sz w:val="24"/>
-                      <w:szCs w:val="24"/>
-                      <w:lang w:eastAsia="ru-RU"/>
-                    </w:rPr>
-                    <w:t>С:Предприятие</w:t>
-                  </w:r>
-                  <w:proofErr w:type="gramEnd"/>
-                  <w:r>
-                    <w:rPr>
-                      <w:rFonts w:ascii="Times New Roman" w:eastAsia="Times New Roman" w:hAnsi="Times New Roman" w:cs="Times New Roman"/>
-                      <w:b/>
-                      <w:bCs/>
-                      <w:sz w:val="24"/>
-                      <w:szCs w:val="24"/>
-                      <w:lang w:eastAsia="ru-RU"/>
-                    </w:rPr>
-                    <w:t>.</w:t>
+                    <w:t>Разработка структуры конфигурации в 1С:Предприятие.</w:t>
                   </w:r>
                   <w:r>
                     <w:rPr>
@@ -7171,27 +7069,7 @@
           <w:szCs w:val="24"/>
           <w:lang w:eastAsia="ru-RU"/>
         </w:rPr>
-        <w:t>Целью выполнения данной курсовой работы является разработка и практическая реализация конфигурации «Магазин ювелирных изделий» на технологической платформе «1</w:t>
-      </w:r>
-      <w:proofErr w:type="gramStart"/>
-      <w:r>
-        <w:rPr>
-          <w:rFonts w:ascii="Times New Roman" w:hAnsi="Times New Roman" w:cs="Times New Roman"/>
-          <w:sz w:val="24"/>
-          <w:szCs w:val="24"/>
-          <w:lang w:eastAsia="ru-RU"/>
-        </w:rPr>
-        <w:t>С:Предприятие</w:t>
-      </w:r>
-      <w:proofErr w:type="gramEnd"/>
-      <w:r>
-        <w:rPr>
-          <w:rFonts w:ascii="Times New Roman" w:hAnsi="Times New Roman" w:cs="Times New Roman"/>
-          <w:sz w:val="24"/>
-          <w:szCs w:val="24"/>
-          <w:lang w:eastAsia="ru-RU"/>
-        </w:rPr>
-        <w:t>», обеспечивающей комплексную автоматизацию оперативного учета движения товаров, фиксации розничных продаж и формирования аналитической отчетности.</w:t>
+        <w:t>Целью выполнения данной курсовой работы является разработка и практическая реализация конфигурации «Магазин ювелирных изделий» на технологической платформе «1С:Предприятие», обеспечивающей комплексную автоматизацию оперативного учета движения товаров, фиксации розничных продаж и формирования аналитической отчетности.</w:t>
       </w:r>
     </w:p>
     <w:p>
@@ -7264,27 +7142,7 @@
           <w:szCs w:val="24"/>
           <w:lang w:eastAsia="ru-RU"/>
         </w:rPr>
-        <w:t>Разработать структуру конфигурации в среде «1</w:t>
-      </w:r>
-      <w:proofErr w:type="gramStart"/>
-      <w:r>
-        <w:rPr>
-          <w:rFonts w:ascii="Times New Roman" w:hAnsi="Times New Roman" w:cs="Times New Roman"/>
-          <w:sz w:val="24"/>
-          <w:szCs w:val="24"/>
-          <w:lang w:eastAsia="ru-RU"/>
-        </w:rPr>
-        <w:t>С:Предприятие</w:t>
-      </w:r>
-      <w:proofErr w:type="gramEnd"/>
-      <w:r>
-        <w:rPr>
-          <w:rFonts w:ascii="Times New Roman" w:hAnsi="Times New Roman" w:cs="Times New Roman"/>
-          <w:sz w:val="24"/>
-          <w:szCs w:val="24"/>
-          <w:lang w:eastAsia="ru-RU"/>
-        </w:rPr>
-        <w:t>», включая создание необходимых подсистем, справочников (номенклатура, клиенты, поставщики) и документов для учета складских операций.</w:t>
+        <w:t>Разработать структуру конфигурации в среде «1С:Предприятие», включая создание необходимых подсистем, справочников (номенклатура, клиенты, поставщики) и документов для учета складских операций.</w:t>
       </w:r>
     </w:p>
     <w:p>
@@ -7421,27 +7279,7 @@
           <w:szCs w:val="24"/>
           <w:lang w:eastAsia="ru-RU"/>
         </w:rPr>
-        <w:t>Объектом исследования является хозяйственная деятельность ООО «Руби» — предприятия розничной торговли ювелирными изделиями, включая процессы закупки, хранения и реализации товаров. Предметом исследования выступают методы и инструменты автоматизации оперативного и складского учета на платформе «1</w:t>
-      </w:r>
-      <w:proofErr w:type="gramStart"/>
-      <w:r>
-        <w:rPr>
-          <w:rFonts w:ascii="Times New Roman" w:hAnsi="Times New Roman" w:cs="Times New Roman"/>
-          <w:sz w:val="24"/>
-          <w:szCs w:val="24"/>
-          <w:lang w:eastAsia="ru-RU"/>
-        </w:rPr>
-        <w:t>С:Предприятие</w:t>
-      </w:r>
-      <w:proofErr w:type="gramEnd"/>
-      <w:r>
-        <w:rPr>
-          <w:rFonts w:ascii="Times New Roman" w:hAnsi="Times New Roman" w:cs="Times New Roman"/>
-          <w:sz w:val="24"/>
-          <w:szCs w:val="24"/>
-          <w:lang w:eastAsia="ru-RU"/>
-        </w:rPr>
-        <w:t>», а также процесс разработки прикладного решения для управления торговой точкой.</w:t>
+        <w:t>Объектом исследования является хозяйственная деятельность ООО «Руби» — предприятия розничной торговли ювелирными изделиями, включая процессы закупки, хранения и реализации товаров. Предметом исследования выступают методы и инструменты автоматизации оперативного и складского учета на платформе «1С:Предприятие», а также процесс разработки прикладного решения для управления торговой точкой.</w:t>
       </w:r>
     </w:p>
     <w:p>
@@ -7629,7 +7467,7 @@
           <w:rFonts w:ascii="Times New Roman" w:hAnsi="Times New Roman" w:cs="Times New Roman"/>
           <w:sz w:val="24"/>
           <w:szCs w:val="24"/>
-          <w:lang w:val="en-US" w:eastAsia="ru-RU"/>
+          <w:lang w:eastAsia="ru-RU"/>
         </w:rPr>
       </w:pPr>
     </w:p>
@@ -8382,27 +8220,7 @@
           <w:szCs w:val="24"/>
           <w:lang w:eastAsia="ru-RU"/>
         </w:rPr>
-        <w:t>В связи с выявленными проблемами было принято решение о разработке специализированной конфигурации на платформе 1</w:t>
-      </w:r>
-      <w:proofErr w:type="gramStart"/>
-      <w:r>
-        <w:rPr>
-          <w:rFonts w:ascii="Times New Roman" w:hAnsi="Times New Roman" w:cs="Times New Roman"/>
-          <w:sz w:val="24"/>
-          <w:szCs w:val="24"/>
-          <w:lang w:eastAsia="ru-RU"/>
-        </w:rPr>
-        <w:t>С:Предприятие</w:t>
-      </w:r>
-      <w:proofErr w:type="gramEnd"/>
-      <w:r>
-        <w:rPr>
-          <w:rFonts w:ascii="Times New Roman" w:hAnsi="Times New Roman" w:cs="Times New Roman"/>
-          <w:sz w:val="24"/>
-          <w:szCs w:val="24"/>
-          <w:lang w:eastAsia="ru-RU"/>
-        </w:rPr>
-        <w:t>, которая позволит автоматизировать ключевые участки учета и устранить перечисленные недостатки.</w:t>
+        <w:t>В связи с выявленными проблемами было принято решение о разработке специализированной конфигурации на платформе 1С:Предприятие, которая позволит автоматизировать ключевые участки учета и устранить перечисленные недостатки.</w:t>
       </w:r>
     </w:p>
     <w:p>
@@ -9749,6 +9567,7 @@
           <w:rFonts w:ascii="Times New Roman" w:hAnsi="Times New Roman" w:cs="Times New Roman"/>
           <w:b/>
           <w:bCs/>
+          <w:noProof/>
           <w:sz w:val="24"/>
           <w:szCs w:val="24"/>
           <w:lang w:eastAsia="ru-RU"/>
@@ -11006,27 +10825,7 @@
           <w:szCs w:val="24"/>
           <w:lang w:eastAsia="ru-RU"/>
         </w:rPr>
-        <w:t>В связи с небольшим масштабом предприятия и численностью сотрудников (10 человек) выделенный сервер отсутствует. Функции сервера выполняет один из наиболее производительных компьютеров, на котором установлена платформа 1</w:t>
-      </w:r>
-      <w:proofErr w:type="gramStart"/>
-      <w:r>
-        <w:rPr>
-          <w:rFonts w:ascii="Times New Roman" w:hAnsi="Times New Roman" w:cs="Times New Roman"/>
-          <w:sz w:val="24"/>
-          <w:szCs w:val="24"/>
-          <w:lang w:eastAsia="ru-RU"/>
-        </w:rPr>
-        <w:t>С:Предприятие</w:t>
-      </w:r>
-      <w:proofErr w:type="gramEnd"/>
-      <w:r>
-        <w:rPr>
-          <w:rFonts w:ascii="Times New Roman" w:hAnsi="Times New Roman" w:cs="Times New Roman"/>
-          <w:sz w:val="24"/>
-          <w:szCs w:val="24"/>
-          <w:lang w:eastAsia="ru-RU"/>
-        </w:rPr>
-        <w:t xml:space="preserve"> в </w:t>
+        <w:t xml:space="preserve">В связи с небольшим масштабом предприятия и численностью сотрудников (10 человек) выделенный сервер отсутствует. Функции сервера выполняет один из наиболее производительных компьютеров, на котором установлена платформа 1С:Предприятие в </w:t>
       </w:r>
       <w:r>
         <w:rPr>
@@ -11429,16 +11228,7 @@
           <w:lang w:eastAsia="ru-RU"/>
         </w:rPr>
         <w:lastRenderedPageBreak/>
-        <w:t xml:space="preserve">Продолжение таблицы 2. </w:t>
-      </w:r>
-      <w:r>
-        <w:rPr>
-          <w:rFonts w:ascii="Times New Roman" w:hAnsi="Times New Roman" w:cs="Times New Roman"/>
-          <w:sz w:val="24"/>
-          <w:szCs w:val="24"/>
-          <w:lang w:eastAsia="ru-RU"/>
-        </w:rPr>
-        <w:t>Характеристики клиентских рабочих станций</w:t>
+        <w:t>Продолжение таблицы 2. Характеристики клиентских рабочих станций</w:t>
       </w:r>
     </w:p>
     <w:tbl>
@@ -12079,6 +11869,7 @@
       <w:r>
         <w:rPr>
           <w:rFonts w:ascii="Times New Roman" w:hAnsi="Times New Roman" w:cs="Times New Roman"/>
+          <w:noProof/>
           <w:sz w:val="24"/>
           <w:szCs w:val="24"/>
           <w:lang w:eastAsia="ru-RU"/>
@@ -12140,25 +11931,7 @@
           <w:szCs w:val="24"/>
           <w:lang w:eastAsia="ru-RU"/>
         </w:rPr>
-        <w:t>Рисунок 2</w:t>
-      </w:r>
-      <w:r>
-        <w:rPr>
-          <w:rFonts w:ascii="Times New Roman" w:hAnsi="Times New Roman" w:cs="Times New Roman"/>
-          <w:sz w:val="24"/>
-          <w:szCs w:val="24"/>
-          <w:lang w:eastAsia="ru-RU"/>
-        </w:rPr>
-        <w:t>.</w:t>
-      </w:r>
-      <w:r>
-        <w:rPr>
-          <w:rFonts w:ascii="Times New Roman" w:hAnsi="Times New Roman" w:cs="Times New Roman"/>
-          <w:sz w:val="24"/>
-          <w:szCs w:val="24"/>
-          <w:lang w:eastAsia="ru-RU"/>
-        </w:rPr>
-        <w:t xml:space="preserve"> Техническая архитектура ООО «Руби»</w:t>
+        <w:t>Рисунок 2. Техническая архитектура ООО «Руби»</w:t>
       </w:r>
     </w:p>
     <w:p>
@@ -12371,27 +12144,7 @@
           <w:szCs w:val="24"/>
           <w:lang w:eastAsia="ru-RU"/>
         </w:rPr>
-        <w:t>1</w:t>
-      </w:r>
-      <w:proofErr w:type="gramStart"/>
-      <w:r>
-        <w:rPr>
-          <w:rFonts w:ascii="Times New Roman" w:hAnsi="Times New Roman" w:cs="Times New Roman"/>
-          <w:sz w:val="24"/>
-          <w:szCs w:val="24"/>
-          <w:lang w:eastAsia="ru-RU"/>
-        </w:rPr>
-        <w:t>С:Предприятие</w:t>
-      </w:r>
-      <w:proofErr w:type="gramEnd"/>
-      <w:r>
-        <w:rPr>
-          <w:rFonts w:ascii="Times New Roman" w:hAnsi="Times New Roman" w:cs="Times New Roman"/>
-          <w:sz w:val="24"/>
-          <w:szCs w:val="24"/>
-          <w:lang w:eastAsia="ru-RU"/>
-        </w:rPr>
-        <w:t xml:space="preserve"> 8.3 </w:t>
+        <w:t xml:space="preserve">1С:Предприятие 8.3 </w:t>
       </w:r>
       <w:r>
         <w:rPr>
@@ -12651,7 +12404,16 @@
           <w:szCs w:val="24"/>
           <w:lang w:eastAsia="ru-RU"/>
         </w:rPr>
-        <w:t>Схема программной архитектуры представлена на рисунке 1.3.</w:t>
+        <w:t>Схема программной архитектуры представлена на рисунке 3.</w:t>
+      </w:r>
+      <w:r>
+        <w:rPr>
+          <w:rFonts w:ascii="Times New Roman" w:hAnsi="Times New Roman" w:cs="Times New Roman"/>
+          <w:sz w:val="24"/>
+          <w:szCs w:val="24"/>
+          <w:lang w:eastAsia="ru-RU"/>
+        </w:rPr>
+        <w:br/>
       </w:r>
     </w:p>
     <w:p>
@@ -12677,6 +12439,1027 @@
           <w:lang w:eastAsia="ru-RU"/>
         </w:rPr>
       </w:pPr>
+      <w:r>
+        <w:rPr>
+          <w:rFonts w:ascii="Times New Roman" w:hAnsi="Times New Roman" w:cs="Times New Roman"/>
+          <w:noProof/>
+          <w:sz w:val="24"/>
+          <w:szCs w:val="24"/>
+          <w:lang w:eastAsia="ru-RU"/>
+        </w:rPr>
+        <w:lastRenderedPageBreak/>
+        <w:drawing>
+          <wp:inline distT="0" distB="0" distL="0" distR="0" wp14:anchorId="0B27B804" wp14:editId="0DCB2322">
+            <wp:extent cx="4229690" cy="4858428"/>
+            <wp:effectExtent l="0" t="0" r="0" b="0"/>
+            <wp:docPr id="4" name="Рисунок 4"/>
+            <wp:cNvGraphicFramePr>
+              <a:graphicFrameLocks xmlns:a="http://schemas.openxmlformats.org/drawingml/2006/main" noChangeAspect="1"/>
+            </wp:cNvGraphicFramePr>
+            <a:graphic xmlns:a="http://schemas.openxmlformats.org/drawingml/2006/main">
+              <a:graphicData uri="http://schemas.openxmlformats.org/drawingml/2006/picture">
+                <pic:pic xmlns:pic="http://schemas.openxmlformats.org/drawingml/2006/picture">
+                  <pic:nvPicPr>
+                    <pic:cNvPr id="1" name=""/>
+                    <pic:cNvPicPr/>
+                  </pic:nvPicPr>
+                  <pic:blipFill>
+                    <a:blip r:embed="rId10"/>
+                    <a:stretch>
+                      <a:fillRect/>
+                    </a:stretch>
+                  </pic:blipFill>
+                  <pic:spPr>
+                    <a:xfrm>
+                      <a:off x="0" y="0"/>
+                      <a:ext cx="4229690" cy="4858428"/>
+                    </a:xfrm>
+                    <a:prstGeom prst="rect">
+                      <a:avLst/>
+                    </a:prstGeom>
+                  </pic:spPr>
+                </pic:pic>
+              </a:graphicData>
+            </a:graphic>
+          </wp:inline>
+        </w:drawing>
+      </w:r>
+    </w:p>
+    <w:p>
+      <w:pPr>
+        <w:spacing w:line="360" w:lineRule="auto"/>
+        <w:ind w:firstLine="709"/>
+        <w:jc w:val="center"/>
+        <w:rPr>
+          <w:rFonts w:ascii="Times New Roman" w:hAnsi="Times New Roman" w:cs="Times New Roman"/>
+          <w:sz w:val="24"/>
+          <w:szCs w:val="24"/>
+          <w:lang w:eastAsia="ru-RU"/>
+        </w:rPr>
+      </w:pPr>
+      <w:r>
+        <w:rPr>
+          <w:rFonts w:ascii="Times New Roman" w:hAnsi="Times New Roman" w:cs="Times New Roman"/>
+          <w:sz w:val="24"/>
+          <w:szCs w:val="24"/>
+          <w:lang w:eastAsia="ru-RU"/>
+        </w:rPr>
+        <w:t>Рисунок 3</w:t>
+      </w:r>
+      <w:r>
+        <w:rPr>
+          <w:rFonts w:ascii="Times New Roman" w:hAnsi="Times New Roman" w:cs="Times New Roman"/>
+          <w:sz w:val="24"/>
+          <w:szCs w:val="24"/>
+          <w:lang w:eastAsia="ru-RU"/>
+        </w:rPr>
+        <w:t xml:space="preserve">. </w:t>
+      </w:r>
+      <w:r>
+        <w:rPr>
+          <w:rFonts w:ascii="Times New Roman" w:hAnsi="Times New Roman" w:cs="Times New Roman"/>
+          <w:sz w:val="24"/>
+          <w:szCs w:val="24"/>
+          <w:lang w:eastAsia="ru-RU"/>
+        </w:rPr>
+        <w:t xml:space="preserve"> Программная архитектура ООО «Руби»</w:t>
+      </w:r>
+    </w:p>
+    <w:p>
+      <w:pPr>
+        <w:spacing w:line="360" w:lineRule="auto"/>
+        <w:ind w:firstLine="709"/>
+        <w:rPr>
+          <w:rFonts w:ascii="Times New Roman" w:hAnsi="Times New Roman" w:cs="Times New Roman"/>
+          <w:sz w:val="24"/>
+          <w:szCs w:val="24"/>
+          <w:lang w:eastAsia="ru-RU"/>
+        </w:rPr>
+      </w:pPr>
+    </w:p>
+    <w:p>
+      <w:pPr>
+        <w:spacing w:line="360" w:lineRule="auto"/>
+        <w:ind w:firstLine="709"/>
+        <w:rPr>
+          <w:rFonts w:ascii="Times New Roman" w:hAnsi="Times New Roman" w:cs="Times New Roman"/>
+          <w:sz w:val="24"/>
+          <w:szCs w:val="24"/>
+          <w:lang w:eastAsia="ru-RU"/>
+        </w:rPr>
+      </w:pPr>
+    </w:p>
+    <w:p>
+      <w:pPr>
+        <w:spacing w:line="360" w:lineRule="auto"/>
+        <w:ind w:firstLine="709"/>
+        <w:rPr>
+          <w:rFonts w:ascii="Times New Roman" w:hAnsi="Times New Roman" w:cs="Times New Roman"/>
+          <w:sz w:val="24"/>
+          <w:szCs w:val="24"/>
+          <w:lang w:eastAsia="ru-RU"/>
+        </w:rPr>
+      </w:pPr>
+    </w:p>
+    <w:p>
+      <w:pPr>
+        <w:spacing w:line="360" w:lineRule="auto"/>
+        <w:ind w:firstLine="709"/>
+        <w:rPr>
+          <w:rFonts w:ascii="Times New Roman" w:hAnsi="Times New Roman" w:cs="Times New Roman"/>
+          <w:sz w:val="24"/>
+          <w:szCs w:val="24"/>
+          <w:lang w:eastAsia="ru-RU"/>
+        </w:rPr>
+      </w:pPr>
+    </w:p>
+    <w:p>
+      <w:pPr>
+        <w:spacing w:line="360" w:lineRule="auto"/>
+        <w:ind w:firstLine="709"/>
+        <w:rPr>
+          <w:rFonts w:ascii="Times New Roman" w:hAnsi="Times New Roman" w:cs="Times New Roman"/>
+          <w:sz w:val="24"/>
+          <w:szCs w:val="24"/>
+          <w:lang w:eastAsia="ru-RU"/>
+        </w:rPr>
+      </w:pPr>
+    </w:p>
+    <w:p>
+      <w:pPr>
+        <w:spacing w:line="360" w:lineRule="auto"/>
+        <w:ind w:firstLine="709"/>
+        <w:rPr>
+          <w:rFonts w:ascii="Times New Roman" w:hAnsi="Times New Roman" w:cs="Times New Roman"/>
+          <w:sz w:val="24"/>
+          <w:szCs w:val="24"/>
+          <w:lang w:eastAsia="ru-RU"/>
+        </w:rPr>
+      </w:pPr>
+    </w:p>
+    <w:p>
+      <w:pPr>
+        <w:spacing w:line="360" w:lineRule="auto"/>
+        <w:ind w:firstLine="709"/>
+        <w:rPr>
+          <w:rFonts w:ascii="Times New Roman" w:hAnsi="Times New Roman" w:cs="Times New Roman"/>
+          <w:sz w:val="24"/>
+          <w:szCs w:val="24"/>
+          <w:lang w:eastAsia="ru-RU"/>
+        </w:rPr>
+      </w:pPr>
+    </w:p>
+    <w:p>
+      <w:pPr>
+        <w:spacing w:line="360" w:lineRule="auto"/>
+        <w:ind w:firstLine="709"/>
+        <w:rPr>
+          <w:rFonts w:ascii="Times New Roman" w:hAnsi="Times New Roman" w:cs="Times New Roman"/>
+          <w:sz w:val="24"/>
+          <w:szCs w:val="24"/>
+          <w:lang w:eastAsia="ru-RU"/>
+        </w:rPr>
+      </w:pPr>
+    </w:p>
+    <w:p>
+      <w:pPr>
+        <w:spacing w:line="360" w:lineRule="auto"/>
+        <w:ind w:firstLine="709"/>
+        <w:rPr>
+          <w:rFonts w:ascii="Times New Roman" w:hAnsi="Times New Roman" w:cs="Times New Roman"/>
+          <w:sz w:val="24"/>
+          <w:szCs w:val="24"/>
+          <w:lang w:eastAsia="ru-RU"/>
+        </w:rPr>
+      </w:pPr>
+    </w:p>
+    <w:p>
+      <w:pPr>
+        <w:spacing w:line="360" w:lineRule="auto"/>
+        <w:ind w:firstLine="709"/>
+        <w:rPr>
+          <w:rFonts w:ascii="Times New Roman" w:hAnsi="Times New Roman" w:cs="Times New Roman"/>
+          <w:sz w:val="24"/>
+          <w:szCs w:val="24"/>
+          <w:lang w:eastAsia="ru-RU"/>
+        </w:rPr>
+      </w:pPr>
+    </w:p>
+    <w:p>
+      <w:pPr>
+        <w:spacing w:line="360" w:lineRule="auto"/>
+        <w:ind w:firstLine="709"/>
+        <w:rPr>
+          <w:rFonts w:ascii="Times New Roman" w:hAnsi="Times New Roman" w:cs="Times New Roman"/>
+          <w:sz w:val="24"/>
+          <w:szCs w:val="24"/>
+          <w:lang w:eastAsia="ru-RU"/>
+        </w:rPr>
+      </w:pPr>
+    </w:p>
+    <w:p>
+      <w:pPr>
+        <w:pStyle w:val="3"/>
+        <w:jc w:val="center"/>
+        <w:rPr>
+          <w:rFonts w:ascii="Times New Roman" w:hAnsi="Times New Roman" w:cs="Times New Roman"/>
+          <w:b/>
+          <w:bCs/>
+          <w:color w:val="000000" w:themeColor="text1"/>
+          <w:lang w:eastAsia="ru-RU"/>
+        </w:rPr>
+      </w:pPr>
+      <w:r>
+        <w:rPr>
+          <w:rFonts w:ascii="Times New Roman" w:hAnsi="Times New Roman" w:cs="Times New Roman"/>
+          <w:b/>
+          <w:bCs/>
+          <w:color w:val="000000" w:themeColor="text1"/>
+          <w:lang w:eastAsia="ru-RU"/>
+        </w:rPr>
+        <w:lastRenderedPageBreak/>
+        <w:t>1.3.3. Обоснование выбора файлового режима работы 1С</w:t>
+      </w:r>
+    </w:p>
+    <w:p>
+      <w:pPr>
+        <w:spacing w:line="360" w:lineRule="auto"/>
+        <w:ind w:firstLine="709"/>
+        <w:rPr>
+          <w:rFonts w:ascii="Times New Roman" w:hAnsi="Times New Roman" w:cs="Times New Roman"/>
+          <w:sz w:val="24"/>
+          <w:szCs w:val="24"/>
+          <w:lang w:eastAsia="ru-RU"/>
+        </w:rPr>
+      </w:pPr>
+    </w:p>
+    <w:p>
+      <w:pPr>
+        <w:spacing w:line="360" w:lineRule="auto"/>
+        <w:ind w:firstLine="709"/>
+        <w:rPr>
+          <w:rFonts w:ascii="Times New Roman" w:hAnsi="Times New Roman" w:cs="Times New Roman"/>
+          <w:sz w:val="24"/>
+          <w:szCs w:val="24"/>
+          <w:lang w:eastAsia="ru-RU"/>
+        </w:rPr>
+      </w:pPr>
+      <w:r>
+        <w:rPr>
+          <w:rFonts w:ascii="Times New Roman" w:hAnsi="Times New Roman" w:cs="Times New Roman"/>
+          <w:sz w:val="24"/>
+          <w:szCs w:val="24"/>
+          <w:lang w:eastAsia="ru-RU"/>
+        </w:rPr>
+        <w:t>В ООО «Руби» принято решение использовать файловый режим работы 1С:Предприятия по следующим причинам:</w:t>
+      </w:r>
+    </w:p>
+    <w:p>
+      <w:pPr>
+        <w:numPr>
+          <w:ilvl w:val="0"/>
+          <w:numId w:val="80"/>
+        </w:numPr>
+        <w:spacing w:line="360" w:lineRule="auto"/>
+        <w:rPr>
+          <w:rFonts w:ascii="Times New Roman" w:hAnsi="Times New Roman" w:cs="Times New Roman"/>
+          <w:sz w:val="24"/>
+          <w:szCs w:val="24"/>
+          <w:lang w:eastAsia="ru-RU"/>
+        </w:rPr>
+      </w:pPr>
+      <w:r>
+        <w:rPr>
+          <w:rFonts w:ascii="Times New Roman" w:hAnsi="Times New Roman" w:cs="Times New Roman"/>
+          <w:sz w:val="24"/>
+          <w:szCs w:val="24"/>
+          <w:lang w:eastAsia="ru-RU"/>
+        </w:rPr>
+        <w:t xml:space="preserve">Небольшое количество одновременных пользователей </w:t>
+      </w:r>
+      <w:r>
+        <w:rPr>
+          <w:rFonts w:ascii="Times New Roman" w:hAnsi="Times New Roman" w:cs="Times New Roman"/>
+          <w:sz w:val="24"/>
+          <w:szCs w:val="24"/>
+          <w:lang w:eastAsia="ru-RU"/>
+        </w:rPr>
+        <w:t>-</w:t>
+      </w:r>
+      <w:r>
+        <w:rPr>
+          <w:rFonts w:ascii="Times New Roman" w:hAnsi="Times New Roman" w:cs="Times New Roman"/>
+          <w:sz w:val="24"/>
+          <w:szCs w:val="24"/>
+          <w:lang w:eastAsia="ru-RU"/>
+        </w:rPr>
+        <w:t xml:space="preserve"> одновременно с конфигурацией работает не более 5-7 человек (продавцы, товаровед, бухгалтер, директор). Наличие 8 компьютеров при 10 сотрудниках обусловлено посменной работой части персонала.</w:t>
+      </w:r>
+    </w:p>
+    <w:p>
+      <w:pPr>
+        <w:numPr>
+          <w:ilvl w:val="0"/>
+          <w:numId w:val="80"/>
+        </w:numPr>
+        <w:spacing w:line="360" w:lineRule="auto"/>
+        <w:rPr>
+          <w:rFonts w:ascii="Times New Roman" w:hAnsi="Times New Roman" w:cs="Times New Roman"/>
+          <w:sz w:val="24"/>
+          <w:szCs w:val="24"/>
+          <w:lang w:eastAsia="ru-RU"/>
+        </w:rPr>
+      </w:pPr>
+      <w:r>
+        <w:rPr>
+          <w:rFonts w:ascii="Times New Roman" w:hAnsi="Times New Roman" w:cs="Times New Roman"/>
+          <w:sz w:val="24"/>
+          <w:szCs w:val="24"/>
+          <w:lang w:eastAsia="ru-RU"/>
+        </w:rPr>
+        <w:t xml:space="preserve">Невысокая интенсивность документооборота </w:t>
+      </w:r>
+      <w:r>
+        <w:rPr>
+          <w:rFonts w:ascii="Times New Roman" w:hAnsi="Times New Roman" w:cs="Times New Roman"/>
+          <w:sz w:val="24"/>
+          <w:szCs w:val="24"/>
+          <w:lang w:eastAsia="ru-RU"/>
+        </w:rPr>
+        <w:t>-</w:t>
+      </w:r>
+      <w:r>
+        <w:rPr>
+          <w:rFonts w:ascii="Times New Roman" w:hAnsi="Times New Roman" w:cs="Times New Roman"/>
+          <w:sz w:val="24"/>
+          <w:szCs w:val="24"/>
+          <w:lang w:eastAsia="ru-RU"/>
+        </w:rPr>
+        <w:t xml:space="preserve"> среднее количество документов в день не превышает 50-70 (приходные накладные, продажи, заказы на услуги).</w:t>
+      </w:r>
+    </w:p>
+    <w:p>
+      <w:pPr>
+        <w:numPr>
+          <w:ilvl w:val="0"/>
+          <w:numId w:val="80"/>
+        </w:numPr>
+        <w:spacing w:line="360" w:lineRule="auto"/>
+        <w:rPr>
+          <w:rFonts w:ascii="Times New Roman" w:hAnsi="Times New Roman" w:cs="Times New Roman"/>
+          <w:sz w:val="24"/>
+          <w:szCs w:val="24"/>
+          <w:lang w:eastAsia="ru-RU"/>
+        </w:rPr>
+      </w:pPr>
+      <w:r>
+        <w:rPr>
+          <w:rFonts w:ascii="Times New Roman" w:hAnsi="Times New Roman" w:cs="Times New Roman"/>
+          <w:sz w:val="24"/>
+          <w:szCs w:val="24"/>
+          <w:lang w:eastAsia="ru-RU"/>
+        </w:rPr>
+        <w:t xml:space="preserve">Простота администрирования </w:t>
+      </w:r>
+      <w:r>
+        <w:rPr>
+          <w:rFonts w:ascii="Times New Roman" w:hAnsi="Times New Roman" w:cs="Times New Roman"/>
+          <w:sz w:val="24"/>
+          <w:szCs w:val="24"/>
+          <w:lang w:eastAsia="ru-RU"/>
+        </w:rPr>
+        <w:t>-</w:t>
+      </w:r>
+      <w:r>
+        <w:rPr>
+          <w:rFonts w:ascii="Times New Roman" w:hAnsi="Times New Roman" w:cs="Times New Roman"/>
+          <w:sz w:val="24"/>
+          <w:szCs w:val="24"/>
+          <w:lang w:eastAsia="ru-RU"/>
+        </w:rPr>
+        <w:t xml:space="preserve"> файловый режим не требует установки и настройки сервера баз данных, что снижает затраты на обслуживание.</w:t>
+      </w:r>
+    </w:p>
+    <w:p>
+      <w:pPr>
+        <w:numPr>
+          <w:ilvl w:val="0"/>
+          <w:numId w:val="80"/>
+        </w:numPr>
+        <w:spacing w:line="360" w:lineRule="auto"/>
+        <w:rPr>
+          <w:rFonts w:ascii="Times New Roman" w:hAnsi="Times New Roman" w:cs="Times New Roman"/>
+          <w:sz w:val="24"/>
+          <w:szCs w:val="24"/>
+          <w:lang w:eastAsia="ru-RU"/>
+        </w:rPr>
+      </w:pPr>
+      <w:r>
+        <w:rPr>
+          <w:rFonts w:ascii="Times New Roman" w:hAnsi="Times New Roman" w:cs="Times New Roman"/>
+          <w:sz w:val="24"/>
+          <w:szCs w:val="24"/>
+          <w:lang w:eastAsia="ru-RU"/>
+        </w:rPr>
+        <w:t xml:space="preserve">Достаточная производительность </w:t>
+      </w:r>
+      <w:r>
+        <w:rPr>
+          <w:rFonts w:ascii="Times New Roman" w:hAnsi="Times New Roman" w:cs="Times New Roman"/>
+          <w:sz w:val="24"/>
+          <w:szCs w:val="24"/>
+          <w:lang w:eastAsia="ru-RU"/>
+        </w:rPr>
+        <w:t>-</w:t>
+      </w:r>
+      <w:r>
+        <w:rPr>
+          <w:rFonts w:ascii="Times New Roman" w:hAnsi="Times New Roman" w:cs="Times New Roman"/>
+          <w:sz w:val="24"/>
+          <w:szCs w:val="24"/>
+          <w:lang w:eastAsia="ru-RU"/>
+        </w:rPr>
+        <w:t xml:space="preserve"> характеристики компьютеров  обеспечивают приемлемую скорость работы в файловом режиме. При этом узким местом может являться использование HDD вместо SSD, однако для документооборота ювелирного магазина этого достаточно.</w:t>
+      </w:r>
+    </w:p>
+    <w:p>
+      <w:pPr>
+        <w:numPr>
+          <w:ilvl w:val="0"/>
+          <w:numId w:val="80"/>
+        </w:numPr>
+        <w:spacing w:line="360" w:lineRule="auto"/>
+        <w:rPr>
+          <w:rFonts w:ascii="Times New Roman" w:hAnsi="Times New Roman" w:cs="Times New Roman"/>
+          <w:sz w:val="24"/>
+          <w:szCs w:val="24"/>
+          <w:lang w:eastAsia="ru-RU"/>
+        </w:rPr>
+      </w:pPr>
+      <w:r>
+        <w:rPr>
+          <w:rFonts w:ascii="Times New Roman" w:hAnsi="Times New Roman" w:cs="Times New Roman"/>
+          <w:sz w:val="24"/>
+          <w:szCs w:val="24"/>
+          <w:lang w:eastAsia="ru-RU"/>
+        </w:rPr>
+        <w:t xml:space="preserve">Низкая стоимость владения </w:t>
+      </w:r>
+      <w:r>
+        <w:rPr>
+          <w:rFonts w:ascii="Times New Roman" w:hAnsi="Times New Roman" w:cs="Times New Roman"/>
+          <w:sz w:val="24"/>
+          <w:szCs w:val="24"/>
+          <w:lang w:eastAsia="ru-RU"/>
+        </w:rPr>
+        <w:t>-</w:t>
+      </w:r>
+      <w:r>
+        <w:rPr>
+          <w:rFonts w:ascii="Times New Roman" w:hAnsi="Times New Roman" w:cs="Times New Roman"/>
+          <w:sz w:val="24"/>
+          <w:szCs w:val="24"/>
+          <w:lang w:eastAsia="ru-RU"/>
+        </w:rPr>
+        <w:t xml:space="preserve"> отсутствуют затраты на приобретение и сопровождение серверных СУБД.</w:t>
+      </w:r>
+    </w:p>
+    <w:p>
+      <w:pPr>
+        <w:spacing w:line="360" w:lineRule="auto"/>
+        <w:ind w:firstLine="709"/>
+        <w:rPr>
+          <w:rFonts w:ascii="Times New Roman" w:hAnsi="Times New Roman" w:cs="Times New Roman"/>
+          <w:sz w:val="24"/>
+          <w:szCs w:val="24"/>
+          <w:lang w:eastAsia="ru-RU"/>
+        </w:rPr>
+      </w:pPr>
+      <w:r>
+        <w:rPr>
+          <w:rFonts w:ascii="Times New Roman" w:hAnsi="Times New Roman" w:cs="Times New Roman"/>
+          <w:sz w:val="24"/>
+          <w:szCs w:val="24"/>
+          <w:lang w:eastAsia="ru-RU"/>
+        </w:rPr>
+        <w:t>При увеличении масштабов деятельности (открытие новых магазинов, рост документооборота) возможен переход на клиент-серверный режим с развертыванием сервера 1С:Предприятия и полноценной СУБД, а также модернизация накопителей до SSD.</w:t>
+      </w:r>
+    </w:p>
+    <w:p>
+      <w:pPr>
+        <w:spacing w:line="360" w:lineRule="auto"/>
+        <w:ind w:firstLine="709"/>
+        <w:rPr>
+          <w:rFonts w:ascii="Times New Roman" w:hAnsi="Times New Roman" w:cs="Times New Roman"/>
+          <w:sz w:val="24"/>
+          <w:szCs w:val="24"/>
+          <w:lang w:eastAsia="ru-RU"/>
+        </w:rPr>
+      </w:pPr>
+    </w:p>
+    <w:p>
+      <w:pPr>
+        <w:spacing w:line="360" w:lineRule="auto"/>
+        <w:ind w:firstLine="709"/>
+        <w:rPr>
+          <w:rFonts w:ascii="Times New Roman" w:hAnsi="Times New Roman" w:cs="Times New Roman"/>
+          <w:sz w:val="24"/>
+          <w:szCs w:val="24"/>
+          <w:lang w:eastAsia="ru-RU"/>
+        </w:rPr>
+      </w:pPr>
+    </w:p>
+    <w:p>
+      <w:pPr>
+        <w:spacing w:line="360" w:lineRule="auto"/>
+        <w:ind w:firstLine="709"/>
+        <w:rPr>
+          <w:rFonts w:ascii="Times New Roman" w:hAnsi="Times New Roman" w:cs="Times New Roman"/>
+          <w:sz w:val="24"/>
+          <w:szCs w:val="24"/>
+          <w:lang w:eastAsia="ru-RU"/>
+        </w:rPr>
+      </w:pPr>
+    </w:p>
+    <w:p>
+      <w:pPr>
+        <w:spacing w:line="360" w:lineRule="auto"/>
+        <w:ind w:firstLine="709"/>
+        <w:rPr>
+          <w:rFonts w:ascii="Times New Roman" w:hAnsi="Times New Roman" w:cs="Times New Roman"/>
+          <w:sz w:val="24"/>
+          <w:szCs w:val="24"/>
+          <w:lang w:eastAsia="ru-RU"/>
+        </w:rPr>
+      </w:pPr>
+    </w:p>
+    <w:p>
+      <w:pPr>
+        <w:spacing w:line="360" w:lineRule="auto"/>
+        <w:ind w:firstLine="709"/>
+        <w:rPr>
+          <w:rFonts w:ascii="Times New Roman" w:hAnsi="Times New Roman" w:cs="Times New Roman"/>
+          <w:sz w:val="24"/>
+          <w:szCs w:val="24"/>
+          <w:lang w:eastAsia="ru-RU"/>
+        </w:rPr>
+      </w:pPr>
+    </w:p>
+    <w:p>
+      <w:pPr>
+        <w:spacing w:line="360" w:lineRule="auto"/>
+        <w:ind w:firstLine="709"/>
+        <w:rPr>
+          <w:rFonts w:ascii="Times New Roman" w:hAnsi="Times New Roman" w:cs="Times New Roman"/>
+          <w:sz w:val="24"/>
+          <w:szCs w:val="24"/>
+          <w:lang w:eastAsia="ru-RU"/>
+        </w:rPr>
+      </w:pPr>
+    </w:p>
+    <w:p>
+      <w:pPr>
+        <w:spacing w:line="360" w:lineRule="auto"/>
+        <w:ind w:firstLine="709"/>
+        <w:rPr>
+          <w:rFonts w:ascii="Times New Roman" w:hAnsi="Times New Roman" w:cs="Times New Roman"/>
+          <w:sz w:val="24"/>
+          <w:szCs w:val="24"/>
+          <w:lang w:eastAsia="ru-RU"/>
+        </w:rPr>
+      </w:pPr>
+    </w:p>
+    <w:p>
+      <w:pPr>
+        <w:spacing w:line="360" w:lineRule="auto"/>
+        <w:ind w:firstLine="709"/>
+        <w:rPr>
+          <w:rFonts w:ascii="Times New Roman" w:hAnsi="Times New Roman" w:cs="Times New Roman"/>
+          <w:sz w:val="24"/>
+          <w:szCs w:val="24"/>
+          <w:lang w:eastAsia="ru-RU"/>
+        </w:rPr>
+      </w:pPr>
+    </w:p>
+    <w:p>
+      <w:pPr>
+        <w:pStyle w:val="2"/>
+        <w:numPr>
+          <w:ilvl w:val="1"/>
+          <w:numId w:val="65"/>
+        </w:numPr>
+        <w:jc w:val="center"/>
+        <w:rPr>
+          <w:rFonts w:ascii="Times New Roman" w:hAnsi="Times New Roman" w:cs="Times New Roman"/>
+          <w:b/>
+          <w:bCs/>
+          <w:color w:val="000000" w:themeColor="text1"/>
+          <w:sz w:val="24"/>
+          <w:szCs w:val="24"/>
+          <w:lang w:eastAsia="ru-RU"/>
+        </w:rPr>
+      </w:pPr>
+      <w:r>
+        <w:rPr>
+          <w:rFonts w:ascii="Times New Roman" w:hAnsi="Times New Roman" w:cs="Times New Roman"/>
+          <w:b/>
+          <w:bCs/>
+          <w:color w:val="000000" w:themeColor="text1"/>
+          <w:sz w:val="24"/>
+          <w:szCs w:val="24"/>
+          <w:lang w:eastAsia="ru-RU"/>
+        </w:rPr>
+        <w:lastRenderedPageBreak/>
+        <w:t>ХАРАКТЕРИСТИКА СУЩЕСТВУЮЩИХ БИЗНЕС-ПРОЦЕССОВ И ОПРЕДЕЛЕНИЕ МЕСТА ПРОЕКТИРУЕМОЙ ЗАДАЧИ В КОМПЛЕКСЕ ЗАДАЧ И ЕЕ ОПИСАНИЕ</w:t>
+      </w:r>
+    </w:p>
+    <w:p>
+      <w:pPr>
+        <w:pStyle w:val="3"/>
+        <w:jc w:val="center"/>
+        <w:rPr>
+          <w:rFonts w:ascii="Times New Roman" w:hAnsi="Times New Roman" w:cs="Times New Roman"/>
+          <w:b/>
+          <w:bCs/>
+          <w:color w:val="000000" w:themeColor="text1"/>
+          <w:lang w:eastAsia="ru-RU"/>
+        </w:rPr>
+      </w:pPr>
+      <w:r>
+        <w:rPr>
+          <w:rFonts w:ascii="Times New Roman" w:hAnsi="Times New Roman" w:cs="Times New Roman"/>
+          <w:b/>
+          <w:bCs/>
+          <w:color w:val="000000" w:themeColor="text1"/>
+          <w:lang w:eastAsia="ru-RU"/>
+        </w:rPr>
+        <w:t>1.4.1. Характеристика существующих бизнес-процессов</w:t>
+      </w:r>
+    </w:p>
+    <w:p>
+      <w:pPr>
+        <w:spacing w:line="360" w:lineRule="auto"/>
+        <w:ind w:firstLine="709"/>
+        <w:rPr>
+          <w:rFonts w:ascii="Times New Roman" w:hAnsi="Times New Roman" w:cs="Times New Roman"/>
+          <w:sz w:val="24"/>
+          <w:szCs w:val="24"/>
+          <w:lang w:eastAsia="ru-RU"/>
+        </w:rPr>
+      </w:pPr>
+    </w:p>
+    <w:p>
+      <w:pPr>
+        <w:spacing w:line="360" w:lineRule="auto"/>
+        <w:ind w:firstLine="709"/>
+        <w:rPr>
+          <w:rFonts w:ascii="Times New Roman" w:hAnsi="Times New Roman" w:cs="Times New Roman"/>
+          <w:sz w:val="24"/>
+          <w:szCs w:val="24"/>
+          <w:lang w:eastAsia="ru-RU"/>
+        </w:rPr>
+      </w:pPr>
+      <w:r>
+        <w:rPr>
+          <w:rFonts w:ascii="Times New Roman" w:hAnsi="Times New Roman" w:cs="Times New Roman"/>
+          <w:sz w:val="24"/>
+          <w:szCs w:val="24"/>
+          <w:lang w:eastAsia="ru-RU"/>
+        </w:rPr>
+        <w:t>Основным видом деятельности ООО «Руби» является розничная продажа ювелирных изделий и оказание сопутствующих услуг</w:t>
+      </w:r>
+      <w:r>
+        <w:rPr>
+          <w:rFonts w:ascii="Times New Roman" w:hAnsi="Times New Roman" w:cs="Times New Roman"/>
+          <w:sz w:val="24"/>
+          <w:szCs w:val="24"/>
+          <w:lang w:eastAsia="ru-RU"/>
+        </w:rPr>
+        <w:t>.</w:t>
+      </w:r>
+      <w:r>
+        <w:rPr>
+          <w:rFonts w:ascii="Times New Roman" w:hAnsi="Times New Roman" w:cs="Times New Roman"/>
+          <w:sz w:val="24"/>
+          <w:szCs w:val="24"/>
+          <w:lang w:eastAsia="ru-RU"/>
+        </w:rPr>
+        <w:t xml:space="preserve"> В процессе работы предприятия можно выделить следующие основные бизнес-процессы:</w:t>
+      </w:r>
+    </w:p>
+    <w:p>
+      <w:pPr>
+        <w:numPr>
+          <w:ilvl w:val="0"/>
+          <w:numId w:val="81"/>
+        </w:numPr>
+        <w:spacing w:line="360" w:lineRule="auto"/>
+        <w:rPr>
+          <w:rFonts w:ascii="Times New Roman" w:hAnsi="Times New Roman" w:cs="Times New Roman"/>
+          <w:sz w:val="24"/>
+          <w:szCs w:val="24"/>
+          <w:lang w:eastAsia="ru-RU"/>
+        </w:rPr>
+      </w:pPr>
+      <w:r>
+        <w:rPr>
+          <w:rFonts w:ascii="Times New Roman" w:hAnsi="Times New Roman" w:cs="Times New Roman"/>
+          <w:sz w:val="24"/>
+          <w:szCs w:val="24"/>
+          <w:lang w:eastAsia="ru-RU"/>
+        </w:rPr>
+        <w:t xml:space="preserve">Поступление товаров от поставщиков </w:t>
+      </w:r>
+      <w:r>
+        <w:rPr>
+          <w:rFonts w:ascii="Times New Roman" w:hAnsi="Times New Roman" w:cs="Times New Roman"/>
+          <w:sz w:val="24"/>
+          <w:szCs w:val="24"/>
+          <w:lang w:eastAsia="ru-RU"/>
+        </w:rPr>
+        <w:t>-</w:t>
+      </w:r>
+      <w:r>
+        <w:rPr>
+          <w:rFonts w:ascii="Times New Roman" w:hAnsi="Times New Roman" w:cs="Times New Roman"/>
+          <w:sz w:val="24"/>
+          <w:szCs w:val="24"/>
+          <w:lang w:eastAsia="ru-RU"/>
+        </w:rPr>
+        <w:t xml:space="preserve"> приемка ювелирных изделий, проверка сопроводительных документов, оприходование на склад.</w:t>
+      </w:r>
+    </w:p>
+    <w:p>
+      <w:pPr>
+        <w:numPr>
+          <w:ilvl w:val="0"/>
+          <w:numId w:val="81"/>
+        </w:numPr>
+        <w:spacing w:line="360" w:lineRule="auto"/>
+        <w:rPr>
+          <w:rFonts w:ascii="Times New Roman" w:hAnsi="Times New Roman" w:cs="Times New Roman"/>
+          <w:sz w:val="24"/>
+          <w:szCs w:val="24"/>
+          <w:lang w:eastAsia="ru-RU"/>
+        </w:rPr>
+      </w:pPr>
+      <w:r>
+        <w:rPr>
+          <w:rFonts w:ascii="Times New Roman" w:hAnsi="Times New Roman" w:cs="Times New Roman"/>
+          <w:sz w:val="24"/>
+          <w:szCs w:val="24"/>
+          <w:lang w:eastAsia="ru-RU"/>
+        </w:rPr>
+        <w:t>Продажа ювелирных издели</w:t>
+      </w:r>
+      <w:r>
+        <w:rPr>
+          <w:rFonts w:ascii="Times New Roman" w:hAnsi="Times New Roman" w:cs="Times New Roman"/>
+          <w:b/>
+          <w:bCs/>
+          <w:sz w:val="24"/>
+          <w:szCs w:val="24"/>
+          <w:lang w:eastAsia="ru-RU"/>
+        </w:rPr>
+        <w:t>й</w:t>
+      </w:r>
+      <w:r>
+        <w:rPr>
+          <w:rFonts w:ascii="Times New Roman" w:hAnsi="Times New Roman" w:cs="Times New Roman"/>
+          <w:sz w:val="24"/>
+          <w:szCs w:val="24"/>
+          <w:lang w:eastAsia="ru-RU"/>
+        </w:rPr>
+        <w:t xml:space="preserve"> </w:t>
+      </w:r>
+      <w:r>
+        <w:rPr>
+          <w:rFonts w:ascii="Times New Roman" w:hAnsi="Times New Roman" w:cs="Times New Roman"/>
+          <w:sz w:val="24"/>
+          <w:szCs w:val="24"/>
+          <w:lang w:eastAsia="ru-RU"/>
+        </w:rPr>
+        <w:t>-</w:t>
+      </w:r>
+      <w:r>
+        <w:rPr>
+          <w:rFonts w:ascii="Times New Roman" w:hAnsi="Times New Roman" w:cs="Times New Roman"/>
+          <w:sz w:val="24"/>
+          <w:szCs w:val="24"/>
+          <w:lang w:eastAsia="ru-RU"/>
+        </w:rPr>
+        <w:t xml:space="preserve"> обслуживание клиентов, оформление продажи, списание товара со склада, выдача чека.</w:t>
+      </w:r>
+    </w:p>
+    <w:p>
+      <w:pPr>
+        <w:numPr>
+          <w:ilvl w:val="0"/>
+          <w:numId w:val="81"/>
+        </w:numPr>
+        <w:spacing w:line="360" w:lineRule="auto"/>
+        <w:rPr>
+          <w:rFonts w:ascii="Times New Roman" w:hAnsi="Times New Roman" w:cs="Times New Roman"/>
+          <w:sz w:val="24"/>
+          <w:szCs w:val="24"/>
+          <w:lang w:eastAsia="ru-RU"/>
+        </w:rPr>
+      </w:pPr>
+      <w:r>
+        <w:rPr>
+          <w:rFonts w:ascii="Times New Roman" w:hAnsi="Times New Roman" w:cs="Times New Roman"/>
+          <w:sz w:val="24"/>
+          <w:szCs w:val="24"/>
+          <w:lang w:eastAsia="ru-RU"/>
+        </w:rPr>
+        <w:t xml:space="preserve">Оказание услуг </w:t>
+      </w:r>
+      <w:r>
+        <w:rPr>
+          <w:rFonts w:ascii="Times New Roman" w:hAnsi="Times New Roman" w:cs="Times New Roman"/>
+          <w:sz w:val="24"/>
+          <w:szCs w:val="24"/>
+          <w:lang w:eastAsia="ru-RU"/>
+        </w:rPr>
+        <w:t>-</w:t>
+      </w:r>
+      <w:r>
+        <w:rPr>
+          <w:rFonts w:ascii="Times New Roman" w:hAnsi="Times New Roman" w:cs="Times New Roman"/>
+          <w:sz w:val="24"/>
+          <w:szCs w:val="24"/>
+          <w:lang w:eastAsia="ru-RU"/>
+        </w:rPr>
+        <w:t xml:space="preserve"> прием заказа на гравировку, ремонт или чистку, выполнение работ, выдача готового изделия клиенту.</w:t>
+      </w:r>
+    </w:p>
+    <w:p>
+      <w:pPr>
+        <w:numPr>
+          <w:ilvl w:val="0"/>
+          <w:numId w:val="81"/>
+        </w:numPr>
+        <w:spacing w:line="360" w:lineRule="auto"/>
+        <w:rPr>
+          <w:rFonts w:ascii="Times New Roman" w:hAnsi="Times New Roman" w:cs="Times New Roman"/>
+          <w:sz w:val="24"/>
+          <w:szCs w:val="24"/>
+          <w:lang w:eastAsia="ru-RU"/>
+        </w:rPr>
+      </w:pPr>
+      <w:r>
+        <w:rPr>
+          <w:rFonts w:ascii="Times New Roman" w:hAnsi="Times New Roman" w:cs="Times New Roman"/>
+          <w:sz w:val="24"/>
+          <w:szCs w:val="24"/>
+          <w:lang w:eastAsia="ru-RU"/>
+        </w:rPr>
+        <w:t xml:space="preserve">Управление товарными запасами </w:t>
+      </w:r>
+      <w:r>
+        <w:rPr>
+          <w:rFonts w:ascii="Times New Roman" w:hAnsi="Times New Roman" w:cs="Times New Roman"/>
+          <w:sz w:val="24"/>
+          <w:szCs w:val="24"/>
+          <w:lang w:eastAsia="ru-RU"/>
+        </w:rPr>
+        <w:t>-</w:t>
+      </w:r>
+      <w:r>
+        <w:rPr>
+          <w:rFonts w:ascii="Times New Roman" w:hAnsi="Times New Roman" w:cs="Times New Roman"/>
+          <w:sz w:val="24"/>
+          <w:szCs w:val="24"/>
+          <w:lang w:eastAsia="ru-RU"/>
+        </w:rPr>
+        <w:t xml:space="preserve"> контроль остатков, формирование заказов поставщикам, проведение инвентаризаций.</w:t>
+      </w:r>
+    </w:p>
+    <w:p>
+      <w:pPr>
+        <w:numPr>
+          <w:ilvl w:val="0"/>
+          <w:numId w:val="81"/>
+        </w:numPr>
+        <w:spacing w:line="360" w:lineRule="auto"/>
+        <w:rPr>
+          <w:rFonts w:ascii="Times New Roman" w:hAnsi="Times New Roman" w:cs="Times New Roman"/>
+          <w:sz w:val="24"/>
+          <w:szCs w:val="24"/>
+          <w:lang w:eastAsia="ru-RU"/>
+        </w:rPr>
+      </w:pPr>
+      <w:r>
+        <w:rPr>
+          <w:rFonts w:ascii="Times New Roman" w:hAnsi="Times New Roman" w:cs="Times New Roman"/>
+          <w:sz w:val="24"/>
+          <w:szCs w:val="24"/>
+          <w:lang w:eastAsia="ru-RU"/>
+        </w:rPr>
+        <w:t xml:space="preserve">Формирование отчетности </w:t>
+      </w:r>
+      <w:r>
+        <w:rPr>
+          <w:rFonts w:ascii="Times New Roman" w:hAnsi="Times New Roman" w:cs="Times New Roman"/>
+          <w:sz w:val="24"/>
+          <w:szCs w:val="24"/>
+          <w:lang w:eastAsia="ru-RU"/>
+        </w:rPr>
+        <w:t>-</w:t>
+      </w:r>
+      <w:r>
+        <w:rPr>
+          <w:rFonts w:ascii="Times New Roman" w:hAnsi="Times New Roman" w:cs="Times New Roman"/>
+          <w:sz w:val="24"/>
+          <w:szCs w:val="24"/>
+          <w:lang w:eastAsia="ru-RU"/>
+        </w:rPr>
+        <w:t xml:space="preserve"> подготовка отчетов о продажах, остатках, доходности услуг.</w:t>
+      </w:r>
+    </w:p>
+    <w:p>
+      <w:pPr>
+        <w:spacing w:line="360" w:lineRule="auto"/>
+        <w:ind w:firstLine="709"/>
+        <w:rPr>
+          <w:rFonts w:ascii="Times New Roman" w:hAnsi="Times New Roman" w:cs="Times New Roman"/>
+          <w:sz w:val="24"/>
+          <w:szCs w:val="24"/>
+          <w:lang w:eastAsia="ru-RU"/>
+        </w:rPr>
+      </w:pPr>
+      <w:r>
+        <w:rPr>
+          <w:rFonts w:ascii="Times New Roman" w:hAnsi="Times New Roman" w:cs="Times New Roman"/>
+          <w:sz w:val="24"/>
+          <w:szCs w:val="24"/>
+          <w:lang w:eastAsia="ru-RU"/>
+        </w:rPr>
+        <w:t>Схема основного бизнес-процесса «Продажа ювелирного изделия» представлена на рисунке 4</w:t>
+      </w:r>
+      <w:r>
+        <w:rPr>
+          <w:rFonts w:ascii="Times New Roman" w:hAnsi="Times New Roman" w:cs="Times New Roman"/>
+          <w:sz w:val="24"/>
+          <w:szCs w:val="24"/>
+          <w:lang w:eastAsia="ru-RU"/>
+        </w:rPr>
+        <w:t xml:space="preserve">. </w:t>
+      </w:r>
+      <w:r>
+        <w:rPr>
+          <w:rFonts w:ascii="Times New Roman" w:hAnsi="Times New Roman" w:cs="Times New Roman"/>
+          <w:sz w:val="24"/>
+          <w:szCs w:val="24"/>
+          <w:lang w:eastAsia="ru-RU"/>
+        </w:rPr>
+        <w:t xml:space="preserve">На входе процесса имеется потребность клиента в приобретении ювелирного изделия, а также наличие товара на складе/витрине. На выходе </w:t>
+      </w:r>
+      <w:r>
+        <w:rPr>
+          <w:rFonts w:ascii="Times New Roman" w:hAnsi="Times New Roman" w:cs="Times New Roman"/>
+          <w:sz w:val="24"/>
+          <w:szCs w:val="24"/>
+          <w:lang w:eastAsia="ru-RU"/>
+        </w:rPr>
+        <w:t xml:space="preserve">- </w:t>
+      </w:r>
+      <w:r>
+        <w:rPr>
+          <w:rFonts w:ascii="Times New Roman" w:hAnsi="Times New Roman" w:cs="Times New Roman"/>
+          <w:sz w:val="24"/>
+          <w:szCs w:val="24"/>
+          <w:lang w:eastAsia="ru-RU"/>
+        </w:rPr>
+        <w:t xml:space="preserve">оформленная продажа, чек и списанный со склада товар. Управлением процесса являются правила торговли, ценовая политика и законодательство о драгоценных металлах. Механизмами </w:t>
+      </w:r>
+      <w:r>
+        <w:rPr>
+          <w:rFonts w:ascii="Times New Roman" w:hAnsi="Times New Roman" w:cs="Times New Roman"/>
+          <w:sz w:val="24"/>
+          <w:szCs w:val="24"/>
+          <w:lang w:eastAsia="ru-RU"/>
+        </w:rPr>
+        <w:t xml:space="preserve">процесса </w:t>
+      </w:r>
+      <w:r>
+        <w:rPr>
+          <w:rFonts w:ascii="Times New Roman" w:hAnsi="Times New Roman" w:cs="Times New Roman"/>
+          <w:sz w:val="24"/>
+          <w:szCs w:val="24"/>
+          <w:lang w:eastAsia="ru-RU"/>
+        </w:rPr>
+        <w:t>-</w:t>
+      </w:r>
+      <w:r>
+        <w:rPr>
+          <w:rFonts w:ascii="Times New Roman" w:hAnsi="Times New Roman" w:cs="Times New Roman"/>
+          <w:sz w:val="24"/>
+          <w:szCs w:val="24"/>
+          <w:lang w:eastAsia="ru-RU"/>
+        </w:rPr>
+        <w:t xml:space="preserve"> продавцы-консультанты и программное обеспечение.</w:t>
+      </w:r>
     </w:p>
     <w:p>
       <w:pPr>
@@ -12760,7 +13543,7 @@
       </w:pPr>
     </w:p>
     <w:sectPr>
-      <w:footerReference w:type="default" r:id="rId10"/>
+      <w:footerReference w:type="default" r:id="rId11"/>
       <w:pgSz w:w="11906" w:h="16838"/>
       <w:pgMar w:top="1134" w:right="567" w:bottom="1134" w:left="1701" w:header="708" w:footer="708" w:gutter="0"/>
       <w:cols w:space="708"/>
@@ -17611,6 +18394,119 @@
     </w:lvl>
   </w:abstractNum>
   <w:abstractNum w:abstractNumId="42" w15:restartNumberingAfterBreak="0">
+    <w:nsid w:val="3FE60D79"/>
+    <w:multiLevelType w:val="multilevel"/>
+    <w:tmpl w:val="140460C6"/>
+    <w:lvl w:ilvl="0">
+      <w:start w:val="1"/>
+      <w:numFmt w:val="decimal"/>
+      <w:lvlText w:val="%1."/>
+      <w:lvlJc w:val="left"/>
+      <w:pPr>
+        <w:tabs>
+          <w:tab w:val="num" w:pos="720"/>
+        </w:tabs>
+        <w:ind w:left="720" w:hanging="360"/>
+      </w:pPr>
+    </w:lvl>
+    <w:lvl w:ilvl="1" w:tentative="1">
+      <w:start w:val="1"/>
+      <w:numFmt w:val="decimal"/>
+      <w:lvlText w:val="%2."/>
+      <w:lvlJc w:val="left"/>
+      <w:pPr>
+        <w:tabs>
+          <w:tab w:val="num" w:pos="1440"/>
+        </w:tabs>
+        <w:ind w:left="1440" w:hanging="360"/>
+      </w:pPr>
+    </w:lvl>
+    <w:lvl w:ilvl="2" w:tentative="1">
+      <w:start w:val="1"/>
+      <w:numFmt w:val="decimal"/>
+      <w:lvlText w:val="%3."/>
+      <w:lvlJc w:val="left"/>
+      <w:pPr>
+        <w:tabs>
+          <w:tab w:val="num" w:pos="2160"/>
+        </w:tabs>
+        <w:ind w:left="2160" w:hanging="360"/>
+      </w:pPr>
+    </w:lvl>
+    <w:lvl w:ilvl="3" w:tentative="1">
+      <w:start w:val="1"/>
+      <w:numFmt w:val="decimal"/>
+      <w:lvlText w:val="%4."/>
+      <w:lvlJc w:val="left"/>
+      <w:pPr>
+        <w:tabs>
+          <w:tab w:val="num" w:pos="2880"/>
+        </w:tabs>
+        <w:ind w:left="2880" w:hanging="360"/>
+      </w:pPr>
+    </w:lvl>
+    <w:lvl w:ilvl="4" w:tentative="1">
+      <w:start w:val="1"/>
+      <w:numFmt w:val="decimal"/>
+      <w:lvlText w:val="%5."/>
+      <w:lvlJc w:val="left"/>
+      <w:pPr>
+        <w:tabs>
+          <w:tab w:val="num" w:pos="3600"/>
+        </w:tabs>
+        <w:ind w:left="3600" w:hanging="360"/>
+      </w:pPr>
+    </w:lvl>
+    <w:lvl w:ilvl="5" w:tentative="1">
+      <w:start w:val="1"/>
+      <w:numFmt w:val="decimal"/>
+      <w:lvlText w:val="%6."/>
+      <w:lvlJc w:val="left"/>
+      <w:pPr>
+        <w:tabs>
+          <w:tab w:val="num" w:pos="4320"/>
+        </w:tabs>
+        <w:ind w:left="4320" w:hanging="360"/>
+      </w:pPr>
+    </w:lvl>
+    <w:lvl w:ilvl="6" w:tentative="1">
+      <w:start w:val="1"/>
+      <w:numFmt w:val="decimal"/>
+      <w:lvlText w:val="%7."/>
+      <w:lvlJc w:val="left"/>
+      <w:pPr>
+        <w:tabs>
+          <w:tab w:val="num" w:pos="5040"/>
+        </w:tabs>
+        <w:ind w:left="5040" w:hanging="360"/>
+      </w:pPr>
+    </w:lvl>
+    <w:lvl w:ilvl="7" w:tentative="1">
+      <w:start w:val="1"/>
+      <w:numFmt w:val="decimal"/>
+      <w:lvlText w:val="%8."/>
+      <w:lvlJc w:val="left"/>
+      <w:pPr>
+        <w:tabs>
+          <w:tab w:val="num" w:pos="5760"/>
+        </w:tabs>
+        <w:ind w:left="5760" w:hanging="360"/>
+      </w:pPr>
+    </w:lvl>
+    <w:lvl w:ilvl="8" w:tentative="1">
+      <w:start w:val="1"/>
+      <w:numFmt w:val="decimal"/>
+      <w:lvlText w:val="%9."/>
+      <w:lvlJc w:val="left"/>
+      <w:pPr>
+        <w:tabs>
+          <w:tab w:val="num" w:pos="6480"/>
+        </w:tabs>
+        <w:ind w:left="6480" w:hanging="360"/>
+      </w:pPr>
+    </w:lvl>
+  </w:abstractNum>
+  <w:abstractNum w:abstractNumId="43" w15:restartNumberingAfterBreak="0">
     <w:nsid w:val="40623D18"/>
     <w:multiLevelType w:val="hybridMultilevel"/>
     <w:tmpl w:val="66E002F2"/>
@@ -17696,7 +18592,7 @@
       </w:pPr>
     </w:lvl>
   </w:abstractNum>
-  <w:abstractNum w:abstractNumId="43" w15:restartNumberingAfterBreak="0">
+  <w:abstractNum w:abstractNumId="44" w15:restartNumberingAfterBreak="0">
     <w:nsid w:val="425B61F6"/>
     <w:multiLevelType w:val="hybridMultilevel"/>
     <w:tmpl w:val="EA6A91D4"/>
@@ -17809,7 +18705,7 @@
       </w:rPr>
     </w:lvl>
   </w:abstractNum>
-  <w:abstractNum w:abstractNumId="44" w15:restartNumberingAfterBreak="0">
+  <w:abstractNum w:abstractNumId="45" w15:restartNumberingAfterBreak="0">
     <w:nsid w:val="42765CC3"/>
     <w:multiLevelType w:val="hybridMultilevel"/>
     <w:tmpl w:val="666A8DDA"/>
@@ -17898,7 +18794,7 @@
       </w:pPr>
     </w:lvl>
   </w:abstractNum>
-  <w:abstractNum w:abstractNumId="45" w15:restartNumberingAfterBreak="0">
+  <w:abstractNum w:abstractNumId="46" w15:restartNumberingAfterBreak="0">
     <w:nsid w:val="42B97D4F"/>
     <w:multiLevelType w:val="hybridMultilevel"/>
     <w:tmpl w:val="4B961F62"/>
@@ -18011,7 +18907,7 @@
       </w:rPr>
     </w:lvl>
   </w:abstractNum>
-  <w:abstractNum w:abstractNumId="46" w15:restartNumberingAfterBreak="0">
+  <w:abstractNum w:abstractNumId="47" w15:restartNumberingAfterBreak="0">
     <w:nsid w:val="45B025B2"/>
     <w:multiLevelType w:val="multilevel"/>
     <w:tmpl w:val="931AD568"/>
@@ -18097,7 +18993,7 @@
       </w:pPr>
     </w:lvl>
   </w:abstractNum>
-  <w:abstractNum w:abstractNumId="47" w15:restartNumberingAfterBreak="0">
+  <w:abstractNum w:abstractNumId="48" w15:restartNumberingAfterBreak="0">
     <w:nsid w:val="48F77668"/>
     <w:multiLevelType w:val="hybridMultilevel"/>
     <w:tmpl w:val="6262DBF4"/>
@@ -18183,7 +19079,7 @@
       </w:pPr>
     </w:lvl>
   </w:abstractNum>
-  <w:abstractNum w:abstractNumId="48" w15:restartNumberingAfterBreak="0">
+  <w:abstractNum w:abstractNumId="49" w15:restartNumberingAfterBreak="0">
     <w:nsid w:val="4AE330B0"/>
     <w:multiLevelType w:val="hybridMultilevel"/>
     <w:tmpl w:val="6484B76E"/>
@@ -18296,7 +19192,7 @@
       </w:rPr>
     </w:lvl>
   </w:abstractNum>
-  <w:abstractNum w:abstractNumId="49" w15:restartNumberingAfterBreak="0">
+  <w:abstractNum w:abstractNumId="50" w15:restartNumberingAfterBreak="0">
     <w:nsid w:val="4B7624D2"/>
     <w:multiLevelType w:val="hybridMultilevel"/>
     <w:tmpl w:val="442EFF82"/>
@@ -18409,7 +19305,7 @@
       </w:rPr>
     </w:lvl>
   </w:abstractNum>
-  <w:abstractNum w:abstractNumId="50" w15:restartNumberingAfterBreak="0">
+  <w:abstractNum w:abstractNumId="51" w15:restartNumberingAfterBreak="0">
     <w:nsid w:val="4BAB306E"/>
     <w:multiLevelType w:val="hybridMultilevel"/>
     <w:tmpl w:val="5F26BE5C"/>
@@ -18522,7 +19418,7 @@
       </w:rPr>
     </w:lvl>
   </w:abstractNum>
-  <w:abstractNum w:abstractNumId="51" w15:restartNumberingAfterBreak="0">
+  <w:abstractNum w:abstractNumId="52" w15:restartNumberingAfterBreak="0">
     <w:nsid w:val="4D450F37"/>
     <w:multiLevelType w:val="hybridMultilevel"/>
     <w:tmpl w:val="BEE6223C"/>
@@ -18635,7 +19531,7 @@
       </w:rPr>
     </w:lvl>
   </w:abstractNum>
-  <w:abstractNum w:abstractNumId="52" w15:restartNumberingAfterBreak="0">
+  <w:abstractNum w:abstractNumId="53" w15:restartNumberingAfterBreak="0">
     <w:nsid w:val="4EF012F3"/>
     <w:multiLevelType w:val="hybridMultilevel"/>
     <w:tmpl w:val="3F10DCF6"/>
@@ -18748,7 +19644,120 @@
       </w:rPr>
     </w:lvl>
   </w:abstractNum>
-  <w:abstractNum w:abstractNumId="53" w15:restartNumberingAfterBreak="0">
+  <w:abstractNum w:abstractNumId="54" w15:restartNumberingAfterBreak="0">
+    <w:nsid w:val="54440AA7"/>
+    <w:multiLevelType w:val="multilevel"/>
+    <w:tmpl w:val="AC0CDCF6"/>
+    <w:lvl w:ilvl="0">
+      <w:start w:val="1"/>
+      <w:numFmt w:val="decimal"/>
+      <w:lvlText w:val="%1."/>
+      <w:lvlJc w:val="left"/>
+      <w:pPr>
+        <w:tabs>
+          <w:tab w:val="num" w:pos="720"/>
+        </w:tabs>
+        <w:ind w:left="720" w:hanging="360"/>
+      </w:pPr>
+    </w:lvl>
+    <w:lvl w:ilvl="1" w:tentative="1">
+      <w:start w:val="1"/>
+      <w:numFmt w:val="decimal"/>
+      <w:lvlText w:val="%2."/>
+      <w:lvlJc w:val="left"/>
+      <w:pPr>
+        <w:tabs>
+          <w:tab w:val="num" w:pos="1440"/>
+        </w:tabs>
+        <w:ind w:left="1440" w:hanging="360"/>
+      </w:pPr>
+    </w:lvl>
+    <w:lvl w:ilvl="2" w:tentative="1">
+      <w:start w:val="1"/>
+      <w:numFmt w:val="decimal"/>
+      <w:lvlText w:val="%3."/>
+      <w:lvlJc w:val="left"/>
+      <w:pPr>
+        <w:tabs>
+          <w:tab w:val="num" w:pos="2160"/>
+        </w:tabs>
+        <w:ind w:left="2160" w:hanging="360"/>
+      </w:pPr>
+    </w:lvl>
+    <w:lvl w:ilvl="3" w:tentative="1">
+      <w:start w:val="1"/>
+      <w:numFmt w:val="decimal"/>
+      <w:lvlText w:val="%4."/>
+      <w:lvlJc w:val="left"/>
+      <w:pPr>
+        <w:tabs>
+          <w:tab w:val="num" w:pos="2880"/>
+        </w:tabs>
+        <w:ind w:left="2880" w:hanging="360"/>
+      </w:pPr>
+    </w:lvl>
+    <w:lvl w:ilvl="4" w:tentative="1">
+      <w:start w:val="1"/>
+      <w:numFmt w:val="decimal"/>
+      <w:lvlText w:val="%5."/>
+      <w:lvlJc w:val="left"/>
+      <w:pPr>
+        <w:tabs>
+          <w:tab w:val="num" w:pos="3600"/>
+        </w:tabs>
+        <w:ind w:left="3600" w:hanging="360"/>
+      </w:pPr>
+    </w:lvl>
+    <w:lvl w:ilvl="5" w:tentative="1">
+      <w:start w:val="1"/>
+      <w:numFmt w:val="decimal"/>
+      <w:lvlText w:val="%6."/>
+      <w:lvlJc w:val="left"/>
+      <w:pPr>
+        <w:tabs>
+          <w:tab w:val="num" w:pos="4320"/>
+        </w:tabs>
+        <w:ind w:left="4320" w:hanging="360"/>
+      </w:pPr>
+    </w:lvl>
+    <w:lvl w:ilvl="6" w:tentative="1">
+      <w:start w:val="1"/>
+      <w:numFmt w:val="decimal"/>
+      <w:lvlText w:val="%7."/>
+      <w:lvlJc w:val="left"/>
+      <w:pPr>
+        <w:tabs>
+          <w:tab w:val="num" w:pos="5040"/>
+        </w:tabs>
+        <w:ind w:left="5040" w:hanging="360"/>
+      </w:pPr>
+    </w:lvl>
+    <w:lvl w:ilvl="7" w:tentative="1">
+      <w:start w:val="1"/>
+      <w:numFmt w:val="decimal"/>
+      <w:lvlText w:val="%8."/>
+      <w:lvlJc w:val="left"/>
+      <w:pPr>
+        <w:tabs>
+          <w:tab w:val="num" w:pos="5760"/>
+        </w:tabs>
+        <w:ind w:left="5760" w:hanging="360"/>
+      </w:pPr>
+    </w:lvl>
+    <w:lvl w:ilvl="8" w:tentative="1">
+      <w:start w:val="1"/>
+      <w:numFmt w:val="decimal"/>
+      <w:lvlText w:val="%9."/>
+      <w:lvlJc w:val="left"/>
+      <w:pPr>
+        <w:tabs>
+          <w:tab w:val="num" w:pos="6480"/>
+        </w:tabs>
+        <w:ind w:left="6480" w:hanging="360"/>
+      </w:pPr>
+    </w:lvl>
+  </w:abstractNum>
+  <w:abstractNum w:abstractNumId="55" w15:restartNumberingAfterBreak="0">
     <w:nsid w:val="54B559B4"/>
     <w:multiLevelType w:val="hybridMultilevel"/>
     <w:tmpl w:val="1FB83692"/>
@@ -18861,7 +19870,7 @@
       </w:rPr>
     </w:lvl>
   </w:abstractNum>
-  <w:abstractNum w:abstractNumId="54" w15:restartNumberingAfterBreak="0">
+  <w:abstractNum w:abstractNumId="56" w15:restartNumberingAfterBreak="0">
     <w:nsid w:val="57B04F11"/>
     <w:multiLevelType w:val="hybridMultilevel"/>
     <w:tmpl w:val="05828F70"/>
@@ -18947,7 +19956,7 @@
       </w:pPr>
     </w:lvl>
   </w:abstractNum>
-  <w:abstractNum w:abstractNumId="55" w15:restartNumberingAfterBreak="0">
+  <w:abstractNum w:abstractNumId="57" w15:restartNumberingAfterBreak="0">
     <w:nsid w:val="58366074"/>
     <w:multiLevelType w:val="hybridMultilevel"/>
     <w:tmpl w:val="0776A1C8"/>
@@ -19060,7 +20069,7 @@
       </w:rPr>
     </w:lvl>
   </w:abstractNum>
-  <w:abstractNum w:abstractNumId="56" w15:restartNumberingAfterBreak="0">
+  <w:abstractNum w:abstractNumId="58" w15:restartNumberingAfterBreak="0">
     <w:nsid w:val="592C43B8"/>
     <w:multiLevelType w:val="hybridMultilevel"/>
     <w:tmpl w:val="4FF6FA62"/>
@@ -19173,7 +20182,7 @@
       </w:rPr>
     </w:lvl>
   </w:abstractNum>
-  <w:abstractNum w:abstractNumId="57" w15:restartNumberingAfterBreak="0">
+  <w:abstractNum w:abstractNumId="59" w15:restartNumberingAfterBreak="0">
     <w:nsid w:val="5A0C5598"/>
     <w:multiLevelType w:val="hybridMultilevel"/>
     <w:tmpl w:val="E1200E86"/>
@@ -19286,7 +20295,7 @@
       </w:rPr>
     </w:lvl>
   </w:abstractNum>
-  <w:abstractNum w:abstractNumId="58" w15:restartNumberingAfterBreak="0">
+  <w:abstractNum w:abstractNumId="60" w15:restartNumberingAfterBreak="0">
     <w:nsid w:val="5F33691E"/>
     <w:multiLevelType w:val="hybridMultilevel"/>
     <w:tmpl w:val="F1A6ED5E"/>
@@ -19399,7 +20408,7 @@
       </w:rPr>
     </w:lvl>
   </w:abstractNum>
-  <w:abstractNum w:abstractNumId="59" w15:restartNumberingAfterBreak="0">
+  <w:abstractNum w:abstractNumId="61" w15:restartNumberingAfterBreak="0">
     <w:nsid w:val="5F725F9C"/>
     <w:multiLevelType w:val="hybridMultilevel"/>
     <w:tmpl w:val="52A014F8"/>
@@ -19512,7 +20521,7 @@
       </w:rPr>
     </w:lvl>
   </w:abstractNum>
-  <w:abstractNum w:abstractNumId="60" w15:restartNumberingAfterBreak="0">
+  <w:abstractNum w:abstractNumId="62" w15:restartNumberingAfterBreak="0">
     <w:nsid w:val="606723D9"/>
     <w:multiLevelType w:val="hybridMultilevel"/>
     <w:tmpl w:val="EC701586"/>
@@ -19625,7 +20634,7 @@
       </w:rPr>
     </w:lvl>
   </w:abstractNum>
-  <w:abstractNum w:abstractNumId="61" w15:restartNumberingAfterBreak="0">
+  <w:abstractNum w:abstractNumId="63" w15:restartNumberingAfterBreak="0">
     <w:nsid w:val="620B0C48"/>
     <w:multiLevelType w:val="multilevel"/>
     <w:tmpl w:val="9EA8052A"/>
@@ -19774,7 +20783,7 @@
       </w:rPr>
     </w:lvl>
   </w:abstractNum>
-  <w:abstractNum w:abstractNumId="62" w15:restartNumberingAfterBreak="0">
+  <w:abstractNum w:abstractNumId="64" w15:restartNumberingAfterBreak="0">
     <w:nsid w:val="62937020"/>
     <w:multiLevelType w:val="hybridMultilevel"/>
     <w:tmpl w:val="9B3CB6AC"/>
@@ -19887,7 +20896,7 @@
       </w:rPr>
     </w:lvl>
   </w:abstractNum>
-  <w:abstractNum w:abstractNumId="63" w15:restartNumberingAfterBreak="0">
+  <w:abstractNum w:abstractNumId="65" w15:restartNumberingAfterBreak="0">
     <w:nsid w:val="640611E3"/>
     <w:multiLevelType w:val="hybridMultilevel"/>
     <w:tmpl w:val="B316C444"/>
@@ -20000,7 +21009,7 @@
       </w:rPr>
     </w:lvl>
   </w:abstractNum>
-  <w:abstractNum w:abstractNumId="64" w15:restartNumberingAfterBreak="0">
+  <w:abstractNum w:abstractNumId="66" w15:restartNumberingAfterBreak="0">
     <w:nsid w:val="68920627"/>
     <w:multiLevelType w:val="multilevel"/>
     <w:tmpl w:val="64F6A51A"/>
@@ -20149,7 +21158,7 @@
       </w:rPr>
     </w:lvl>
   </w:abstractNum>
-  <w:abstractNum w:abstractNumId="65" w15:restartNumberingAfterBreak="0">
+  <w:abstractNum w:abstractNumId="67" w15:restartNumberingAfterBreak="0">
     <w:nsid w:val="68F5525E"/>
     <w:multiLevelType w:val="hybridMultilevel"/>
     <w:tmpl w:val="438262D4"/>
@@ -20262,7 +21271,7 @@
       </w:rPr>
     </w:lvl>
   </w:abstractNum>
-  <w:abstractNum w:abstractNumId="66" w15:restartNumberingAfterBreak="0">
+  <w:abstractNum w:abstractNumId="68" w15:restartNumberingAfterBreak="0">
     <w:nsid w:val="692E4AA2"/>
     <w:multiLevelType w:val="multilevel"/>
     <w:tmpl w:val="D826E884"/>
@@ -20411,7 +21420,7 @@
       </w:rPr>
     </w:lvl>
   </w:abstractNum>
-  <w:abstractNum w:abstractNumId="67" w15:restartNumberingAfterBreak="0">
+  <w:abstractNum w:abstractNumId="69" w15:restartNumberingAfterBreak="0">
     <w:nsid w:val="72C115D8"/>
     <w:multiLevelType w:val="hybridMultilevel"/>
     <w:tmpl w:val="4B6285B4"/>
@@ -20524,7 +21533,7 @@
       </w:rPr>
     </w:lvl>
   </w:abstractNum>
-  <w:abstractNum w:abstractNumId="68" w15:restartNumberingAfterBreak="0">
+  <w:abstractNum w:abstractNumId="70" w15:restartNumberingAfterBreak="0">
     <w:nsid w:val="74BB7C8A"/>
     <w:multiLevelType w:val="hybridMultilevel"/>
     <w:tmpl w:val="43F0C8F6"/>
@@ -20637,7 +21646,7 @@
       </w:rPr>
     </w:lvl>
   </w:abstractNum>
-  <w:abstractNum w:abstractNumId="69" w15:restartNumberingAfterBreak="0">
+  <w:abstractNum w:abstractNumId="71" w15:restartNumberingAfterBreak="0">
     <w:nsid w:val="767703C1"/>
     <w:multiLevelType w:val="hybridMultilevel"/>
     <w:tmpl w:val="6A103DC6"/>
@@ -20750,7 +21759,7 @@
       </w:rPr>
     </w:lvl>
   </w:abstractNum>
-  <w:abstractNum w:abstractNumId="70" w15:restartNumberingAfterBreak="0">
+  <w:abstractNum w:abstractNumId="72" w15:restartNumberingAfterBreak="0">
     <w:nsid w:val="77791F79"/>
     <w:multiLevelType w:val="hybridMultilevel"/>
     <w:tmpl w:val="4AE0F9C8"/>
@@ -20863,7 +21872,7 @@
       </w:rPr>
     </w:lvl>
   </w:abstractNum>
-  <w:abstractNum w:abstractNumId="71" w15:restartNumberingAfterBreak="0">
+  <w:abstractNum w:abstractNumId="73" w15:restartNumberingAfterBreak="0">
     <w:nsid w:val="77D8669A"/>
     <w:multiLevelType w:val="multilevel"/>
     <w:tmpl w:val="E534ABF8"/>
@@ -20976,7 +21985,7 @@
       </w:rPr>
     </w:lvl>
   </w:abstractNum>
-  <w:abstractNum w:abstractNumId="72" w15:restartNumberingAfterBreak="0">
+  <w:abstractNum w:abstractNumId="74" w15:restartNumberingAfterBreak="0">
     <w:nsid w:val="7AB0084F"/>
     <w:multiLevelType w:val="hybridMultilevel"/>
     <w:tmpl w:val="E2F6805C"/>
@@ -21089,7 +22098,7 @@
       </w:rPr>
     </w:lvl>
   </w:abstractNum>
-  <w:abstractNum w:abstractNumId="73" w15:restartNumberingAfterBreak="0">
+  <w:abstractNum w:abstractNumId="75" w15:restartNumberingAfterBreak="0">
     <w:nsid w:val="7ACF29FB"/>
     <w:multiLevelType w:val="hybridMultilevel"/>
     <w:tmpl w:val="7D92EFA8"/>
@@ -21202,7 +22211,7 @@
       </w:rPr>
     </w:lvl>
   </w:abstractNum>
-  <w:abstractNum w:abstractNumId="74" w15:restartNumberingAfterBreak="0">
+  <w:abstractNum w:abstractNumId="76" w15:restartNumberingAfterBreak="0">
     <w:nsid w:val="7B6055F6"/>
     <w:multiLevelType w:val="hybridMultilevel"/>
     <w:tmpl w:val="0276EAFE"/>
@@ -21315,7 +22324,7 @@
       </w:rPr>
     </w:lvl>
   </w:abstractNum>
-  <w:abstractNum w:abstractNumId="75" w15:restartNumberingAfterBreak="0">
+  <w:abstractNum w:abstractNumId="77" w15:restartNumberingAfterBreak="0">
     <w:nsid w:val="7B634ED8"/>
     <w:multiLevelType w:val="multilevel"/>
     <w:tmpl w:val="0F72FFEC"/>
@@ -21464,7 +22473,7 @@
       </w:rPr>
     </w:lvl>
   </w:abstractNum>
-  <w:abstractNum w:abstractNumId="76" w15:restartNumberingAfterBreak="0">
+  <w:abstractNum w:abstractNumId="78" w15:restartNumberingAfterBreak="0">
     <w:nsid w:val="7C826507"/>
     <w:multiLevelType w:val="hybridMultilevel"/>
     <w:tmpl w:val="6A1AD090"/>
@@ -21577,7 +22586,7 @@
       </w:rPr>
     </w:lvl>
   </w:abstractNum>
-  <w:abstractNum w:abstractNumId="77" w15:restartNumberingAfterBreak="0">
+  <w:abstractNum w:abstractNumId="79" w15:restartNumberingAfterBreak="0">
     <w:nsid w:val="7C9A6C70"/>
     <w:multiLevelType w:val="hybridMultilevel"/>
     <w:tmpl w:val="C9DE025C"/>
@@ -21690,7 +22699,7 @@
       </w:rPr>
     </w:lvl>
   </w:abstractNum>
-  <w:abstractNum w:abstractNumId="78" w15:restartNumberingAfterBreak="0">
+  <w:abstractNum w:abstractNumId="80" w15:restartNumberingAfterBreak="0">
     <w:nsid w:val="7F734494"/>
     <w:multiLevelType w:val="multilevel"/>
     <w:tmpl w:val="25A8E580"/>
@@ -21840,7 +22849,7 @@
     </w:lvl>
   </w:abstractNum>
   <w:num w:numId="1" w16cid:durableId="1634484901">
-    <w:abstractNumId w:val="46"/>
+    <w:abstractNumId w:val="47"/>
     <w:lvlOverride w:ilvl="0">
       <w:startOverride w:val="1"/>
     </w:lvlOverride>
@@ -21870,55 +22879,55 @@
     </w:lvlOverride>
   </w:num>
   <w:num w:numId="2" w16cid:durableId="1959531119">
-    <w:abstractNumId w:val="68"/>
+    <w:abstractNumId w:val="70"/>
   </w:num>
   <w:num w:numId="3" w16cid:durableId="1073045902">
     <w:abstractNumId w:val="9"/>
   </w:num>
   <w:num w:numId="4" w16cid:durableId="416825806">
-    <w:abstractNumId w:val="45"/>
+    <w:abstractNumId w:val="46"/>
   </w:num>
   <w:num w:numId="5" w16cid:durableId="1956402015">
-    <w:abstractNumId w:val="49"/>
+    <w:abstractNumId w:val="50"/>
   </w:num>
   <w:num w:numId="6" w16cid:durableId="205341918">
-    <w:abstractNumId w:val="60"/>
+    <w:abstractNumId w:val="62"/>
   </w:num>
   <w:num w:numId="7" w16cid:durableId="1493523565">
     <w:abstractNumId w:val="24"/>
   </w:num>
   <w:num w:numId="8" w16cid:durableId="319506301">
-    <w:abstractNumId w:val="70"/>
+    <w:abstractNumId w:val="72"/>
   </w:num>
   <w:num w:numId="9" w16cid:durableId="585571800">
-    <w:abstractNumId w:val="57"/>
+    <w:abstractNumId w:val="59"/>
   </w:num>
   <w:num w:numId="10" w16cid:durableId="1612979678">
-    <w:abstractNumId w:val="67"/>
+    <w:abstractNumId w:val="69"/>
   </w:num>
   <w:num w:numId="11" w16cid:durableId="1844709084">
     <w:abstractNumId w:val="18"/>
   </w:num>
   <w:num w:numId="12" w16cid:durableId="1131627668">
-    <w:abstractNumId w:val="73"/>
+    <w:abstractNumId w:val="75"/>
   </w:num>
   <w:num w:numId="13" w16cid:durableId="1860852656">
-    <w:abstractNumId w:val="65"/>
+    <w:abstractNumId w:val="67"/>
   </w:num>
   <w:num w:numId="14" w16cid:durableId="1385063776">
-    <w:abstractNumId w:val="43"/>
+    <w:abstractNumId w:val="44"/>
   </w:num>
   <w:num w:numId="15" w16cid:durableId="1916209449">
-    <w:abstractNumId w:val="55"/>
+    <w:abstractNumId w:val="57"/>
   </w:num>
   <w:num w:numId="16" w16cid:durableId="217015910">
-    <w:abstractNumId w:val="53"/>
+    <w:abstractNumId w:val="55"/>
   </w:num>
   <w:num w:numId="17" w16cid:durableId="1242719167">
     <w:abstractNumId w:val="4"/>
   </w:num>
   <w:num w:numId="18" w16cid:durableId="1494876502">
-    <w:abstractNumId w:val="56"/>
+    <w:abstractNumId w:val="58"/>
   </w:num>
   <w:num w:numId="19" w16cid:durableId="827213196">
     <w:abstractNumId w:val="28"/>
@@ -21930,7 +22939,7 @@
     <w:abstractNumId w:val="34"/>
   </w:num>
   <w:num w:numId="22" w16cid:durableId="1233078227">
-    <w:abstractNumId w:val="47"/>
+    <w:abstractNumId w:val="48"/>
   </w:num>
   <w:num w:numId="23" w16cid:durableId="1959022623">
     <w:abstractNumId w:val="27"/>
@@ -21942,7 +22951,7 @@
     <w:abstractNumId w:val="35"/>
   </w:num>
   <w:num w:numId="26" w16cid:durableId="694499547">
-    <w:abstractNumId w:val="42"/>
+    <w:abstractNumId w:val="43"/>
     <w:lvlOverride w:ilvl="0">
       <w:startOverride w:val="1"/>
     </w:lvlOverride>
@@ -21972,7 +22981,7 @@
     </w:lvlOverride>
   </w:num>
   <w:num w:numId="27" w16cid:durableId="303312832">
-    <w:abstractNumId w:val="76"/>
+    <w:abstractNumId w:val="78"/>
   </w:num>
   <w:num w:numId="28" w16cid:durableId="1100878979">
     <w:abstractNumId w:val="1"/>
@@ -21987,7 +22996,7 @@
     <w:abstractNumId w:val="21"/>
   </w:num>
   <w:num w:numId="32" w16cid:durableId="1789397452">
-    <w:abstractNumId w:val="63"/>
+    <w:abstractNumId w:val="65"/>
   </w:num>
   <w:num w:numId="33" w16cid:durableId="94641903">
     <w:abstractNumId w:val="31"/>
@@ -21996,22 +23005,22 @@
     <w:abstractNumId w:val="16"/>
   </w:num>
   <w:num w:numId="35" w16cid:durableId="541552221">
-    <w:abstractNumId w:val="69"/>
+    <w:abstractNumId w:val="71"/>
   </w:num>
   <w:num w:numId="36" w16cid:durableId="1167670498">
     <w:abstractNumId w:val="20"/>
   </w:num>
   <w:num w:numId="37" w16cid:durableId="862521516">
-    <w:abstractNumId w:val="48"/>
+    <w:abstractNumId w:val="49"/>
   </w:num>
   <w:num w:numId="38" w16cid:durableId="425076568">
     <w:abstractNumId w:val="17"/>
   </w:num>
   <w:num w:numId="39" w16cid:durableId="1893148603">
-    <w:abstractNumId w:val="77"/>
+    <w:abstractNumId w:val="79"/>
   </w:num>
   <w:num w:numId="40" w16cid:durableId="910039547">
-    <w:abstractNumId w:val="74"/>
+    <w:abstractNumId w:val="76"/>
   </w:num>
   <w:num w:numId="41" w16cid:durableId="247233665">
     <w:abstractNumId w:val="0"/>
@@ -22023,7 +23032,7 @@
     <w:abstractNumId w:val="3"/>
   </w:num>
   <w:num w:numId="44" w16cid:durableId="1496218522">
-    <w:abstractNumId w:val="62"/>
+    <w:abstractNumId w:val="64"/>
   </w:num>
   <w:num w:numId="45" w16cid:durableId="519663253">
     <w:abstractNumId w:val="40"/>
@@ -22032,22 +23041,22 @@
     <w:abstractNumId w:val="25"/>
   </w:num>
   <w:num w:numId="47" w16cid:durableId="1164784168">
-    <w:abstractNumId w:val="52"/>
+    <w:abstractNumId w:val="53"/>
   </w:num>
   <w:num w:numId="48" w16cid:durableId="676738232">
     <w:abstractNumId w:val="23"/>
   </w:num>
   <w:num w:numId="49" w16cid:durableId="1223754734">
-    <w:abstractNumId w:val="58"/>
+    <w:abstractNumId w:val="60"/>
   </w:num>
   <w:num w:numId="50" w16cid:durableId="1322855666">
-    <w:abstractNumId w:val="59"/>
+    <w:abstractNumId w:val="61"/>
   </w:num>
   <w:num w:numId="51" w16cid:durableId="1011831926">
     <w:abstractNumId w:val="5"/>
   </w:num>
   <w:num w:numId="52" w16cid:durableId="1767529811">
-    <w:abstractNumId w:val="72"/>
+    <w:abstractNumId w:val="74"/>
   </w:num>
   <w:num w:numId="53" w16cid:durableId="232086285">
     <w:abstractNumId w:val="6"/>
@@ -22068,7 +23077,7 @@
     <w:abstractNumId w:val="14"/>
   </w:num>
   <w:num w:numId="59" w16cid:durableId="265236349">
-    <w:abstractNumId w:val="54"/>
+    <w:abstractNumId w:val="56"/>
   </w:num>
   <w:num w:numId="60" w16cid:durableId="1643315755">
     <w:abstractNumId w:val="32"/>
@@ -22086,37 +23095,37 @@
     <w:abstractNumId w:val="39"/>
   </w:num>
   <w:num w:numId="65" w16cid:durableId="2054883036">
-    <w:abstractNumId w:val="71"/>
+    <w:abstractNumId w:val="73"/>
   </w:num>
   <w:num w:numId="66" w16cid:durableId="1990282445">
     <w:abstractNumId w:val="12"/>
   </w:num>
   <w:num w:numId="67" w16cid:durableId="1891069188">
-    <w:abstractNumId w:val="78"/>
+    <w:abstractNumId w:val="80"/>
   </w:num>
   <w:num w:numId="68" w16cid:durableId="1116946595">
-    <w:abstractNumId w:val="75"/>
+    <w:abstractNumId w:val="77"/>
   </w:num>
   <w:num w:numId="69" w16cid:durableId="1571503253">
-    <w:abstractNumId w:val="66"/>
+    <w:abstractNumId w:val="68"/>
   </w:num>
   <w:num w:numId="70" w16cid:durableId="541598846">
-    <w:abstractNumId w:val="64"/>
+    <w:abstractNumId w:val="66"/>
   </w:num>
   <w:num w:numId="71" w16cid:durableId="1272594382">
     <w:abstractNumId w:val="26"/>
   </w:num>
   <w:num w:numId="72" w16cid:durableId="2038657697">
-    <w:abstractNumId w:val="44"/>
+    <w:abstractNumId w:val="45"/>
   </w:num>
   <w:num w:numId="73" w16cid:durableId="87391195">
     <w:abstractNumId w:val="41"/>
   </w:num>
   <w:num w:numId="74" w16cid:durableId="1118374828">
-    <w:abstractNumId w:val="61"/>
+    <w:abstractNumId w:val="63"/>
   </w:num>
   <w:num w:numId="75" w16cid:durableId="1557814546">
-    <w:abstractNumId w:val="51"/>
+    <w:abstractNumId w:val="52"/>
   </w:num>
   <w:num w:numId="76" w16cid:durableId="415056844">
     <w:abstractNumId w:val="19"/>
@@ -22128,7 +23137,13 @@
     <w:abstractNumId w:val="36"/>
   </w:num>
   <w:num w:numId="79" w16cid:durableId="916786535">
-    <w:abstractNumId w:val="50"/>
+    <w:abstractNumId w:val="51"/>
+  </w:num>
+  <w:num w:numId="80" w16cid:durableId="142821879">
+    <w:abstractNumId w:val="42"/>
+  </w:num>
+  <w:num w:numId="81" w16cid:durableId="702096556">
+    <w:abstractNumId w:val="54"/>
   </w:num>
   <w:numIdMacAtCleanup w:val="58"/>
 </w:numbering>
@@ -22606,6 +23621,7 @@
   <w:style w:type="character" w:default="1" w:styleId="a0">
     <w:name w:val="Default Paragraph Font"/>
     <w:uiPriority w:val="1"/>
+    <w:semiHidden/>
     <w:unhideWhenUsed/>
   </w:style>
   <w:style w:type="table" w:default="1" w:styleId="a1">

</xml_diff>